<commit_message>
logical addressing created for subnets & vlans
</commit_message>
<xml_diff>
--- a/project plan.docx
+++ b/project plan.docx
@@ -16,7 +16,10 @@
         </w:numPr>
       </w:pPr>
       <w:r>
-        <w:t>Production 100</w:t>
+        <w:t xml:space="preserve">Production </w:t>
+      </w:r>
+      <w:r>
+        <w:t>200 (100 staff + 100 BYOD)</w:t>
       </w:r>
     </w:p>
     <w:p>
@@ -28,7 +31,10 @@
         </w:numPr>
       </w:pPr>
       <w:r>
-        <w:t>Warehouse 20</w:t>
+        <w:t xml:space="preserve">Warehouse </w:t>
+      </w:r>
+      <w:r>
+        <w:t>40 (20 staff + 20 BYOD)</w:t>
       </w:r>
     </w:p>
     <w:p>
@@ -40,7 +46,10 @@
         </w:numPr>
       </w:pPr>
       <w:r>
-        <w:t>Sales &amp; marketing 20</w:t>
+        <w:t xml:space="preserve">Sales &amp; marketing </w:t>
+      </w:r>
+      <w:r>
+        <w:t>40 (20 staff + 20 BYOD)</w:t>
       </w:r>
     </w:p>
     <w:p>
@@ -52,7 +61,10 @@
         </w:numPr>
       </w:pPr>
       <w:r>
-        <w:t>Finance 10</w:t>
+        <w:t xml:space="preserve">Finance </w:t>
+      </w:r>
+      <w:r>
+        <w:t>20 (10 staff + 10 BYOD)</w:t>
       </w:r>
     </w:p>
     <w:p>
@@ -64,7 +76,10 @@
         </w:numPr>
       </w:pPr>
       <w:r>
-        <w:t>R&amp;D 30</w:t>
+        <w:t xml:space="preserve">R&amp;D </w:t>
+      </w:r>
+      <w:r>
+        <w:t>60 (30 staff + 30 BYOD)</w:t>
       </w:r>
     </w:p>
     <w:p>
@@ -76,7 +91,10 @@
         </w:numPr>
       </w:pPr>
       <w:r>
-        <w:t>Management 30</w:t>
+        <w:t xml:space="preserve">Management </w:t>
+      </w:r>
+      <w:r>
+        <w:t>60 (30 staff + 30 BYOD)</w:t>
       </w:r>
     </w:p>
     <w:p>
@@ -84,6 +102,1339 @@
         <w:t>Dedicated computer connections (laptops &amp; PCs). Certain staff (sales &amp; marketing) need BYOD for future expansion</w:t>
       </w:r>
     </w:p>
+    <w:p/>
+    <w:p>
+      <w:r>
+        <w:t>VLSM:</w:t>
+      </w:r>
+      <w:r>
+        <w:br/>
+      </w:r>
+    </w:p>
+    <w:tbl>
+      <w:tblPr>
+        <w:tblStyle w:val="TableGrid"/>
+        <w:tblW w:w="0" w:type="auto"/>
+        <w:tblLook w:val="04A0" w:firstRow="1" w:lastRow="0" w:firstColumn="1" w:lastColumn="0" w:noHBand="0" w:noVBand="1"/>
+      </w:tblPr>
+      <w:tblGrid>
+        <w:gridCol w:w="1385"/>
+        <w:gridCol w:w="1006"/>
+        <w:gridCol w:w="906"/>
+        <w:gridCol w:w="1393"/>
+        <w:gridCol w:w="2314"/>
+        <w:gridCol w:w="1162"/>
+        <w:gridCol w:w="850"/>
+      </w:tblGrid>
+      <w:tr>
+        <w:tc>
+          <w:tcPr>
+            <w:tcW w:w="1385" w:type="dxa"/>
+            <w:shd w:val="clear" w:color="auto" w:fill="F6C5AC" w:themeFill="accent2" w:themeFillTint="66"/>
+          </w:tcPr>
+          <w:p>
+            <w:pPr>
+              <w:rPr>
+                <w:sz w:val="20"/>
+                <w:szCs w:val="20"/>
+              </w:rPr>
+            </w:pPr>
+            <w:r>
+              <w:rPr>
+                <w:sz w:val="20"/>
+                <w:szCs w:val="20"/>
+              </w:rPr>
+              <w:t>Department</w:t>
+            </w:r>
+          </w:p>
+        </w:tc>
+        <w:tc>
+          <w:tcPr>
+            <w:tcW w:w="1006" w:type="dxa"/>
+            <w:shd w:val="clear" w:color="auto" w:fill="F6C5AC" w:themeFill="accent2" w:themeFillTint="66"/>
+          </w:tcPr>
+          <w:p>
+            <w:pPr>
+              <w:rPr>
+                <w:sz w:val="20"/>
+                <w:szCs w:val="20"/>
+              </w:rPr>
+            </w:pPr>
+            <w:r>
+              <w:rPr>
+                <w:sz w:val="20"/>
+                <w:szCs w:val="20"/>
+              </w:rPr>
+              <w:t>Hosts available</w:t>
+            </w:r>
+          </w:p>
+        </w:tc>
+        <w:tc>
+          <w:tcPr>
+            <w:tcW w:w="865" w:type="dxa"/>
+            <w:shd w:val="clear" w:color="auto" w:fill="F6C5AC" w:themeFill="accent2" w:themeFillTint="66"/>
+          </w:tcPr>
+          <w:p>
+            <w:pPr>
+              <w:rPr>
+                <w:sz w:val="20"/>
+                <w:szCs w:val="20"/>
+              </w:rPr>
+            </w:pPr>
+            <w:r>
+              <w:rPr>
+                <w:sz w:val="20"/>
+                <w:szCs w:val="20"/>
+              </w:rPr>
+              <w:t>Unused Hosts</w:t>
+            </w:r>
+          </w:p>
+        </w:tc>
+        <w:tc>
+          <w:tcPr>
+            <w:tcW w:w="1400" w:type="dxa"/>
+            <w:shd w:val="clear" w:color="auto" w:fill="F6C5AC" w:themeFill="accent2" w:themeFillTint="66"/>
+          </w:tcPr>
+          <w:p>
+            <w:pPr>
+              <w:rPr>
+                <w:sz w:val="20"/>
+                <w:szCs w:val="20"/>
+              </w:rPr>
+            </w:pPr>
+            <w:r>
+              <w:rPr>
+                <w:sz w:val="20"/>
+                <w:szCs w:val="20"/>
+              </w:rPr>
+              <w:t>Network ID</w:t>
+            </w:r>
+          </w:p>
+        </w:tc>
+        <w:tc>
+          <w:tcPr>
+            <w:tcW w:w="2348" w:type="dxa"/>
+            <w:shd w:val="clear" w:color="auto" w:fill="F6C5AC" w:themeFill="accent2" w:themeFillTint="66"/>
+          </w:tcPr>
+          <w:p>
+            <w:pPr>
+              <w:rPr>
+                <w:sz w:val="20"/>
+                <w:szCs w:val="20"/>
+              </w:rPr>
+            </w:pPr>
+            <w:r>
+              <w:rPr>
+                <w:sz w:val="20"/>
+                <w:szCs w:val="20"/>
+              </w:rPr>
+              <w:t>Useable Hosts</w:t>
+            </w:r>
+          </w:p>
+        </w:tc>
+        <w:tc>
+          <w:tcPr>
+            <w:tcW w:w="1162" w:type="dxa"/>
+            <w:shd w:val="clear" w:color="auto" w:fill="F6C5AC" w:themeFill="accent2" w:themeFillTint="66"/>
+          </w:tcPr>
+          <w:p>
+            <w:pPr>
+              <w:rPr>
+                <w:sz w:val="20"/>
+                <w:szCs w:val="20"/>
+              </w:rPr>
+            </w:pPr>
+            <w:r>
+              <w:rPr>
+                <w:sz w:val="20"/>
+                <w:szCs w:val="20"/>
+              </w:rPr>
+              <w:t>Broadcast ID</w:t>
+            </w:r>
+          </w:p>
+        </w:tc>
+        <w:tc>
+          <w:tcPr>
+            <w:tcW w:w="850" w:type="dxa"/>
+            <w:shd w:val="clear" w:color="auto" w:fill="F6C5AC" w:themeFill="accent2" w:themeFillTint="66"/>
+          </w:tcPr>
+          <w:p>
+            <w:pPr>
+              <w:rPr>
+                <w:sz w:val="20"/>
+                <w:szCs w:val="20"/>
+              </w:rPr>
+            </w:pPr>
+            <w:r>
+              <w:rPr>
+                <w:sz w:val="20"/>
+                <w:szCs w:val="20"/>
+              </w:rPr>
+              <w:t>Subnet Mask</w:t>
+            </w:r>
+          </w:p>
+        </w:tc>
+      </w:tr>
+      <w:tr>
+        <w:tc>
+          <w:tcPr>
+            <w:tcW w:w="1385" w:type="dxa"/>
+            <w:shd w:val="clear" w:color="auto" w:fill="F2F2F2" w:themeFill="background1" w:themeFillShade="F2"/>
+          </w:tcPr>
+          <w:p>
+            <w:pPr>
+              <w:rPr>
+                <w:sz w:val="20"/>
+                <w:szCs w:val="20"/>
+              </w:rPr>
+            </w:pPr>
+            <w:r>
+              <w:rPr>
+                <w:sz w:val="20"/>
+                <w:szCs w:val="20"/>
+              </w:rPr>
+              <w:t>Production (200hosts)</w:t>
+            </w:r>
+          </w:p>
+        </w:tc>
+        <w:tc>
+          <w:tcPr>
+            <w:tcW w:w="1006" w:type="dxa"/>
+            <w:shd w:val="clear" w:color="auto" w:fill="F2F2F2" w:themeFill="background1" w:themeFillShade="F2"/>
+          </w:tcPr>
+          <w:p>
+            <w:pPr>
+              <w:rPr>
+                <w:sz w:val="20"/>
+                <w:szCs w:val="20"/>
+              </w:rPr>
+            </w:pPr>
+            <w:r>
+              <w:rPr>
+                <w:sz w:val="20"/>
+                <w:szCs w:val="20"/>
+              </w:rPr>
+              <w:t>254</w:t>
+            </w:r>
+          </w:p>
+        </w:tc>
+        <w:tc>
+          <w:tcPr>
+            <w:tcW w:w="865" w:type="dxa"/>
+            <w:shd w:val="clear" w:color="auto" w:fill="F2F2F2" w:themeFill="background1" w:themeFillShade="F2"/>
+          </w:tcPr>
+          <w:p>
+            <w:pPr>
+              <w:rPr>
+                <w:sz w:val="20"/>
+                <w:szCs w:val="20"/>
+              </w:rPr>
+            </w:pPr>
+            <w:r>
+              <w:rPr>
+                <w:sz w:val="20"/>
+                <w:szCs w:val="20"/>
+              </w:rPr>
+              <w:t>54</w:t>
+            </w:r>
+          </w:p>
+        </w:tc>
+        <w:tc>
+          <w:tcPr>
+            <w:tcW w:w="1400" w:type="dxa"/>
+            <w:shd w:val="clear" w:color="auto" w:fill="F2F2F2" w:themeFill="background1" w:themeFillShade="F2"/>
+          </w:tcPr>
+          <w:p>
+            <w:pPr>
+              <w:rPr>
+                <w:sz w:val="20"/>
+                <w:szCs w:val="20"/>
+              </w:rPr>
+            </w:pPr>
+            <w:r>
+              <w:rPr>
+                <w:sz w:val="20"/>
+                <w:szCs w:val="20"/>
+              </w:rPr>
+              <w:t>10.0.0.0</w:t>
+            </w:r>
+          </w:p>
+        </w:tc>
+        <w:tc>
+          <w:tcPr>
+            <w:tcW w:w="2348" w:type="dxa"/>
+            <w:shd w:val="clear" w:color="auto" w:fill="F2F2F2" w:themeFill="background1" w:themeFillShade="F2"/>
+          </w:tcPr>
+          <w:p>
+            <w:pPr>
+              <w:rPr>
+                <w:sz w:val="20"/>
+                <w:szCs w:val="20"/>
+              </w:rPr>
+            </w:pPr>
+            <w:r>
+              <w:rPr>
+                <w:sz w:val="20"/>
+                <w:szCs w:val="20"/>
+              </w:rPr>
+              <w:t>10.0.0.</w:t>
+            </w:r>
+            <w:r>
+              <w:rPr>
+                <w:sz w:val="20"/>
+                <w:szCs w:val="20"/>
+              </w:rPr>
+              <w:t xml:space="preserve">1 - </w:t>
+            </w:r>
+            <w:r>
+              <w:rPr>
+                <w:sz w:val="20"/>
+                <w:szCs w:val="20"/>
+              </w:rPr>
+              <w:t>10.0.0.</w:t>
+            </w:r>
+            <w:r>
+              <w:rPr>
+                <w:sz w:val="20"/>
+                <w:szCs w:val="20"/>
+              </w:rPr>
+              <w:t>254</w:t>
+            </w:r>
+          </w:p>
+        </w:tc>
+        <w:tc>
+          <w:tcPr>
+            <w:tcW w:w="1162" w:type="dxa"/>
+            <w:shd w:val="clear" w:color="auto" w:fill="F2F2F2" w:themeFill="background1" w:themeFillShade="F2"/>
+          </w:tcPr>
+          <w:p>
+            <w:pPr>
+              <w:rPr>
+                <w:sz w:val="20"/>
+                <w:szCs w:val="20"/>
+              </w:rPr>
+            </w:pPr>
+            <w:r>
+              <w:rPr>
+                <w:sz w:val="20"/>
+                <w:szCs w:val="20"/>
+              </w:rPr>
+              <w:t>10.0.0.</w:t>
+            </w:r>
+            <w:r>
+              <w:rPr>
+                <w:sz w:val="20"/>
+                <w:szCs w:val="20"/>
+              </w:rPr>
+              <w:t>255</w:t>
+            </w:r>
+          </w:p>
+        </w:tc>
+        <w:tc>
+          <w:tcPr>
+            <w:tcW w:w="850" w:type="dxa"/>
+            <w:shd w:val="clear" w:color="auto" w:fill="F2F2F2" w:themeFill="background1" w:themeFillShade="F2"/>
+          </w:tcPr>
+          <w:p>
+            <w:pPr>
+              <w:rPr>
+                <w:sz w:val="20"/>
+                <w:szCs w:val="20"/>
+              </w:rPr>
+            </w:pPr>
+            <w:r>
+              <w:rPr>
+                <w:sz w:val="20"/>
+                <w:szCs w:val="20"/>
+              </w:rPr>
+              <w:t>/24</w:t>
+            </w:r>
+          </w:p>
+        </w:tc>
+      </w:tr>
+      <w:tr>
+        <w:tc>
+          <w:tcPr>
+            <w:tcW w:w="1385" w:type="dxa"/>
+            <w:shd w:val="clear" w:color="auto" w:fill="D9D9D9" w:themeFill="background1" w:themeFillShade="D9"/>
+          </w:tcPr>
+          <w:p>
+            <w:pPr>
+              <w:rPr>
+                <w:sz w:val="20"/>
+                <w:szCs w:val="20"/>
+              </w:rPr>
+            </w:pPr>
+            <w:r>
+              <w:rPr>
+                <w:sz w:val="20"/>
+                <w:szCs w:val="20"/>
+              </w:rPr>
+              <w:t>Management (60hosts)</w:t>
+            </w:r>
+          </w:p>
+        </w:tc>
+        <w:tc>
+          <w:tcPr>
+            <w:tcW w:w="1006" w:type="dxa"/>
+            <w:shd w:val="clear" w:color="auto" w:fill="D9D9D9" w:themeFill="background1" w:themeFillShade="D9"/>
+          </w:tcPr>
+          <w:p>
+            <w:pPr>
+              <w:ind w:left="720" w:hanging="720"/>
+              <w:rPr>
+                <w:sz w:val="20"/>
+                <w:szCs w:val="20"/>
+              </w:rPr>
+            </w:pPr>
+            <w:r>
+              <w:rPr>
+                <w:sz w:val="20"/>
+                <w:szCs w:val="20"/>
+              </w:rPr>
+              <w:t>62</w:t>
+            </w:r>
+          </w:p>
+        </w:tc>
+        <w:tc>
+          <w:tcPr>
+            <w:tcW w:w="865" w:type="dxa"/>
+            <w:shd w:val="clear" w:color="auto" w:fill="D9D9D9" w:themeFill="background1" w:themeFillShade="D9"/>
+          </w:tcPr>
+          <w:p>
+            <w:pPr>
+              <w:ind w:left="720" w:hanging="720"/>
+              <w:rPr>
+                <w:sz w:val="20"/>
+                <w:szCs w:val="20"/>
+              </w:rPr>
+            </w:pPr>
+            <w:r>
+              <w:rPr>
+                <w:sz w:val="20"/>
+                <w:szCs w:val="20"/>
+              </w:rPr>
+              <w:t>2</w:t>
+            </w:r>
+          </w:p>
+        </w:tc>
+        <w:tc>
+          <w:tcPr>
+            <w:tcW w:w="1400" w:type="dxa"/>
+            <w:shd w:val="clear" w:color="auto" w:fill="D9D9D9" w:themeFill="background1" w:themeFillShade="D9"/>
+          </w:tcPr>
+          <w:p>
+            <w:pPr>
+              <w:ind w:left="720" w:hanging="720"/>
+              <w:rPr>
+                <w:sz w:val="20"/>
+                <w:szCs w:val="20"/>
+              </w:rPr>
+            </w:pPr>
+            <w:r>
+              <w:rPr>
+                <w:sz w:val="20"/>
+                <w:szCs w:val="20"/>
+              </w:rPr>
+              <w:t>10.0.1.0</w:t>
+            </w:r>
+          </w:p>
+        </w:tc>
+        <w:tc>
+          <w:tcPr>
+            <w:tcW w:w="2348" w:type="dxa"/>
+            <w:shd w:val="clear" w:color="auto" w:fill="D9D9D9" w:themeFill="background1" w:themeFillShade="D9"/>
+          </w:tcPr>
+          <w:p>
+            <w:pPr>
+              <w:rPr>
+                <w:sz w:val="20"/>
+                <w:szCs w:val="20"/>
+              </w:rPr>
+            </w:pPr>
+            <w:r>
+              <w:rPr>
+                <w:sz w:val="20"/>
+                <w:szCs w:val="20"/>
+              </w:rPr>
+              <w:t>10.0.1.</w:t>
+            </w:r>
+            <w:r>
+              <w:rPr>
+                <w:sz w:val="20"/>
+                <w:szCs w:val="20"/>
+              </w:rPr>
+              <w:t xml:space="preserve">1 - </w:t>
+            </w:r>
+            <w:r>
+              <w:rPr>
+                <w:sz w:val="20"/>
+                <w:szCs w:val="20"/>
+              </w:rPr>
+              <w:t>10.0.1.</w:t>
+            </w:r>
+            <w:r>
+              <w:rPr>
+                <w:sz w:val="20"/>
+                <w:szCs w:val="20"/>
+              </w:rPr>
+              <w:t>62</w:t>
+            </w:r>
+          </w:p>
+        </w:tc>
+        <w:tc>
+          <w:tcPr>
+            <w:tcW w:w="1162" w:type="dxa"/>
+            <w:shd w:val="clear" w:color="auto" w:fill="D9D9D9" w:themeFill="background1" w:themeFillShade="D9"/>
+          </w:tcPr>
+          <w:p>
+            <w:pPr>
+              <w:rPr>
+                <w:sz w:val="20"/>
+                <w:szCs w:val="20"/>
+              </w:rPr>
+            </w:pPr>
+            <w:r>
+              <w:rPr>
+                <w:sz w:val="20"/>
+                <w:szCs w:val="20"/>
+              </w:rPr>
+              <w:t>10.0.1.</w:t>
+            </w:r>
+            <w:r>
+              <w:rPr>
+                <w:sz w:val="20"/>
+                <w:szCs w:val="20"/>
+              </w:rPr>
+              <w:t>63</w:t>
+            </w:r>
+          </w:p>
+        </w:tc>
+        <w:tc>
+          <w:tcPr>
+            <w:tcW w:w="850" w:type="dxa"/>
+            <w:shd w:val="clear" w:color="auto" w:fill="D9D9D9" w:themeFill="background1" w:themeFillShade="D9"/>
+          </w:tcPr>
+          <w:p>
+            <w:pPr>
+              <w:rPr>
+                <w:sz w:val="20"/>
+                <w:szCs w:val="20"/>
+              </w:rPr>
+            </w:pPr>
+            <w:r>
+              <w:rPr>
+                <w:sz w:val="20"/>
+                <w:szCs w:val="20"/>
+              </w:rPr>
+              <w:t>/26</w:t>
+            </w:r>
+          </w:p>
+        </w:tc>
+      </w:tr>
+      <w:tr>
+        <w:tc>
+          <w:tcPr>
+            <w:tcW w:w="1385" w:type="dxa"/>
+            <w:shd w:val="clear" w:color="auto" w:fill="F2F2F2" w:themeFill="background1" w:themeFillShade="F2"/>
+          </w:tcPr>
+          <w:p>
+            <w:pPr>
+              <w:rPr>
+                <w:sz w:val="20"/>
+                <w:szCs w:val="20"/>
+              </w:rPr>
+            </w:pPr>
+            <w:r>
+              <w:rPr>
+                <w:sz w:val="20"/>
+                <w:szCs w:val="20"/>
+              </w:rPr>
+              <w:t>R&amp;D (60hosts)</w:t>
+            </w:r>
+          </w:p>
+        </w:tc>
+        <w:tc>
+          <w:tcPr>
+            <w:tcW w:w="1006" w:type="dxa"/>
+            <w:shd w:val="clear" w:color="auto" w:fill="F2F2F2" w:themeFill="background1" w:themeFillShade="F2"/>
+          </w:tcPr>
+          <w:p>
+            <w:pPr>
+              <w:rPr>
+                <w:sz w:val="20"/>
+                <w:szCs w:val="20"/>
+              </w:rPr>
+            </w:pPr>
+            <w:r>
+              <w:rPr>
+                <w:sz w:val="20"/>
+                <w:szCs w:val="20"/>
+              </w:rPr>
+              <w:t>62</w:t>
+            </w:r>
+          </w:p>
+        </w:tc>
+        <w:tc>
+          <w:tcPr>
+            <w:tcW w:w="865" w:type="dxa"/>
+            <w:shd w:val="clear" w:color="auto" w:fill="F2F2F2" w:themeFill="background1" w:themeFillShade="F2"/>
+          </w:tcPr>
+          <w:p>
+            <w:pPr>
+              <w:rPr>
+                <w:sz w:val="20"/>
+                <w:szCs w:val="20"/>
+              </w:rPr>
+            </w:pPr>
+            <w:r>
+              <w:rPr>
+                <w:sz w:val="20"/>
+                <w:szCs w:val="20"/>
+              </w:rPr>
+              <w:t>2</w:t>
+            </w:r>
+          </w:p>
+        </w:tc>
+        <w:tc>
+          <w:tcPr>
+            <w:tcW w:w="1400" w:type="dxa"/>
+            <w:shd w:val="clear" w:color="auto" w:fill="F2F2F2" w:themeFill="background1" w:themeFillShade="F2"/>
+          </w:tcPr>
+          <w:p>
+            <w:pPr>
+              <w:rPr>
+                <w:sz w:val="20"/>
+                <w:szCs w:val="20"/>
+              </w:rPr>
+            </w:pPr>
+            <w:r>
+              <w:rPr>
+                <w:sz w:val="20"/>
+                <w:szCs w:val="20"/>
+              </w:rPr>
+              <w:t>10.0.1.</w:t>
+            </w:r>
+            <w:r>
+              <w:rPr>
+                <w:sz w:val="20"/>
+                <w:szCs w:val="20"/>
+              </w:rPr>
+              <w:t>64</w:t>
+            </w:r>
+          </w:p>
+        </w:tc>
+        <w:tc>
+          <w:tcPr>
+            <w:tcW w:w="2348" w:type="dxa"/>
+            <w:shd w:val="clear" w:color="auto" w:fill="F2F2F2" w:themeFill="background1" w:themeFillShade="F2"/>
+          </w:tcPr>
+          <w:p>
+            <w:pPr>
+              <w:rPr>
+                <w:sz w:val="20"/>
+                <w:szCs w:val="20"/>
+              </w:rPr>
+            </w:pPr>
+            <w:r>
+              <w:rPr>
+                <w:sz w:val="20"/>
+                <w:szCs w:val="20"/>
+              </w:rPr>
+              <w:t>10.0.1</w:t>
+            </w:r>
+            <w:r>
+              <w:rPr>
+                <w:sz w:val="20"/>
+                <w:szCs w:val="20"/>
+              </w:rPr>
+              <w:t xml:space="preserve">.65 - </w:t>
+            </w:r>
+            <w:r>
+              <w:rPr>
+                <w:sz w:val="20"/>
+                <w:szCs w:val="20"/>
+              </w:rPr>
+              <w:t>10.0.1.</w:t>
+            </w:r>
+            <w:r>
+              <w:rPr>
+                <w:sz w:val="20"/>
+                <w:szCs w:val="20"/>
+              </w:rPr>
+              <w:t>126</w:t>
+            </w:r>
+          </w:p>
+        </w:tc>
+        <w:tc>
+          <w:tcPr>
+            <w:tcW w:w="1162" w:type="dxa"/>
+            <w:shd w:val="clear" w:color="auto" w:fill="F2F2F2" w:themeFill="background1" w:themeFillShade="F2"/>
+          </w:tcPr>
+          <w:p>
+            <w:pPr>
+              <w:rPr>
+                <w:sz w:val="20"/>
+                <w:szCs w:val="20"/>
+              </w:rPr>
+            </w:pPr>
+            <w:r>
+              <w:rPr>
+                <w:sz w:val="20"/>
+                <w:szCs w:val="20"/>
+              </w:rPr>
+              <w:t>10.0.1.</w:t>
+            </w:r>
+            <w:r>
+              <w:rPr>
+                <w:sz w:val="20"/>
+                <w:szCs w:val="20"/>
+              </w:rPr>
+              <w:t>127</w:t>
+            </w:r>
+          </w:p>
+        </w:tc>
+        <w:tc>
+          <w:tcPr>
+            <w:tcW w:w="850" w:type="dxa"/>
+            <w:shd w:val="clear" w:color="auto" w:fill="F2F2F2" w:themeFill="background1" w:themeFillShade="F2"/>
+          </w:tcPr>
+          <w:p>
+            <w:pPr>
+              <w:rPr>
+                <w:sz w:val="20"/>
+                <w:szCs w:val="20"/>
+              </w:rPr>
+            </w:pPr>
+            <w:r>
+              <w:rPr>
+                <w:sz w:val="20"/>
+                <w:szCs w:val="20"/>
+              </w:rPr>
+              <w:t>/26</w:t>
+            </w:r>
+          </w:p>
+        </w:tc>
+      </w:tr>
+      <w:tr>
+        <w:tc>
+          <w:tcPr>
+            <w:tcW w:w="1385" w:type="dxa"/>
+            <w:shd w:val="clear" w:color="auto" w:fill="D9D9D9" w:themeFill="background1" w:themeFillShade="D9"/>
+          </w:tcPr>
+          <w:p>
+            <w:pPr>
+              <w:rPr>
+                <w:sz w:val="20"/>
+                <w:szCs w:val="20"/>
+              </w:rPr>
+            </w:pPr>
+            <w:r>
+              <w:rPr>
+                <w:sz w:val="20"/>
+                <w:szCs w:val="20"/>
+              </w:rPr>
+              <w:t>Sales (40hosts)</w:t>
+            </w:r>
+          </w:p>
+        </w:tc>
+        <w:tc>
+          <w:tcPr>
+            <w:tcW w:w="1006" w:type="dxa"/>
+            <w:shd w:val="clear" w:color="auto" w:fill="D9D9D9" w:themeFill="background1" w:themeFillShade="D9"/>
+          </w:tcPr>
+          <w:p>
+            <w:pPr>
+              <w:rPr>
+                <w:sz w:val="20"/>
+                <w:szCs w:val="20"/>
+              </w:rPr>
+            </w:pPr>
+            <w:r>
+              <w:rPr>
+                <w:sz w:val="20"/>
+                <w:szCs w:val="20"/>
+              </w:rPr>
+              <w:t>62</w:t>
+            </w:r>
+          </w:p>
+        </w:tc>
+        <w:tc>
+          <w:tcPr>
+            <w:tcW w:w="865" w:type="dxa"/>
+            <w:shd w:val="clear" w:color="auto" w:fill="D9D9D9" w:themeFill="background1" w:themeFillShade="D9"/>
+          </w:tcPr>
+          <w:p>
+            <w:pPr>
+              <w:rPr>
+                <w:sz w:val="20"/>
+                <w:szCs w:val="20"/>
+              </w:rPr>
+            </w:pPr>
+            <w:r>
+              <w:rPr>
+                <w:sz w:val="20"/>
+                <w:szCs w:val="20"/>
+              </w:rPr>
+              <w:t>22</w:t>
+            </w:r>
+          </w:p>
+        </w:tc>
+        <w:tc>
+          <w:tcPr>
+            <w:tcW w:w="1400" w:type="dxa"/>
+            <w:shd w:val="clear" w:color="auto" w:fill="D9D9D9" w:themeFill="background1" w:themeFillShade="D9"/>
+          </w:tcPr>
+          <w:p>
+            <w:pPr>
+              <w:rPr>
+                <w:sz w:val="20"/>
+                <w:szCs w:val="20"/>
+              </w:rPr>
+            </w:pPr>
+            <w:r>
+              <w:rPr>
+                <w:sz w:val="20"/>
+                <w:szCs w:val="20"/>
+              </w:rPr>
+              <w:t>10.0.1.</w:t>
+            </w:r>
+            <w:r>
+              <w:rPr>
+                <w:sz w:val="20"/>
+                <w:szCs w:val="20"/>
+              </w:rPr>
+              <w:t>128</w:t>
+            </w:r>
+          </w:p>
+        </w:tc>
+        <w:tc>
+          <w:tcPr>
+            <w:tcW w:w="2348" w:type="dxa"/>
+            <w:shd w:val="clear" w:color="auto" w:fill="D9D9D9" w:themeFill="background1" w:themeFillShade="D9"/>
+          </w:tcPr>
+          <w:p>
+            <w:pPr>
+              <w:rPr>
+                <w:sz w:val="20"/>
+                <w:szCs w:val="20"/>
+              </w:rPr>
+            </w:pPr>
+            <w:r>
+              <w:rPr>
+                <w:sz w:val="20"/>
+                <w:szCs w:val="20"/>
+              </w:rPr>
+              <w:t>10.0.1.</w:t>
+            </w:r>
+            <w:r>
+              <w:rPr>
+                <w:sz w:val="20"/>
+                <w:szCs w:val="20"/>
+              </w:rPr>
+              <w:t xml:space="preserve">129 - </w:t>
+            </w:r>
+            <w:r>
+              <w:rPr>
+                <w:sz w:val="20"/>
+                <w:szCs w:val="20"/>
+              </w:rPr>
+              <w:t>10.0.1.</w:t>
+            </w:r>
+            <w:r>
+              <w:rPr>
+                <w:sz w:val="20"/>
+                <w:szCs w:val="20"/>
+              </w:rPr>
+              <w:t>190</w:t>
+            </w:r>
+          </w:p>
+        </w:tc>
+        <w:tc>
+          <w:tcPr>
+            <w:tcW w:w="1162" w:type="dxa"/>
+            <w:shd w:val="clear" w:color="auto" w:fill="D9D9D9" w:themeFill="background1" w:themeFillShade="D9"/>
+          </w:tcPr>
+          <w:p>
+            <w:pPr>
+              <w:rPr>
+                <w:sz w:val="20"/>
+                <w:szCs w:val="20"/>
+              </w:rPr>
+            </w:pPr>
+            <w:r>
+              <w:rPr>
+                <w:sz w:val="20"/>
+                <w:szCs w:val="20"/>
+              </w:rPr>
+              <w:t>10.0.1.</w:t>
+            </w:r>
+            <w:r>
+              <w:rPr>
+                <w:sz w:val="20"/>
+                <w:szCs w:val="20"/>
+              </w:rPr>
+              <w:t>191</w:t>
+            </w:r>
+          </w:p>
+        </w:tc>
+        <w:tc>
+          <w:tcPr>
+            <w:tcW w:w="850" w:type="dxa"/>
+            <w:shd w:val="clear" w:color="auto" w:fill="D9D9D9" w:themeFill="background1" w:themeFillShade="D9"/>
+          </w:tcPr>
+          <w:p>
+            <w:pPr>
+              <w:rPr>
+                <w:sz w:val="20"/>
+                <w:szCs w:val="20"/>
+              </w:rPr>
+            </w:pPr>
+            <w:r>
+              <w:rPr>
+                <w:sz w:val="20"/>
+                <w:szCs w:val="20"/>
+              </w:rPr>
+              <w:t>/26</w:t>
+            </w:r>
+          </w:p>
+        </w:tc>
+      </w:tr>
+      <w:tr>
+        <w:tc>
+          <w:tcPr>
+            <w:tcW w:w="1385" w:type="dxa"/>
+            <w:shd w:val="clear" w:color="auto" w:fill="F2F2F2" w:themeFill="background1" w:themeFillShade="F2"/>
+          </w:tcPr>
+          <w:p>
+            <w:pPr>
+              <w:rPr>
+                <w:sz w:val="20"/>
+                <w:szCs w:val="20"/>
+              </w:rPr>
+            </w:pPr>
+            <w:r>
+              <w:rPr>
+                <w:sz w:val="20"/>
+                <w:szCs w:val="20"/>
+              </w:rPr>
+              <w:t>Warehouse (40hosts)</w:t>
+            </w:r>
+          </w:p>
+        </w:tc>
+        <w:tc>
+          <w:tcPr>
+            <w:tcW w:w="1006" w:type="dxa"/>
+            <w:shd w:val="clear" w:color="auto" w:fill="F2F2F2" w:themeFill="background1" w:themeFillShade="F2"/>
+          </w:tcPr>
+          <w:p>
+            <w:pPr>
+              <w:rPr>
+                <w:sz w:val="20"/>
+                <w:szCs w:val="20"/>
+              </w:rPr>
+            </w:pPr>
+            <w:r>
+              <w:rPr>
+                <w:sz w:val="20"/>
+                <w:szCs w:val="20"/>
+              </w:rPr>
+              <w:t>62</w:t>
+            </w:r>
+          </w:p>
+        </w:tc>
+        <w:tc>
+          <w:tcPr>
+            <w:tcW w:w="865" w:type="dxa"/>
+            <w:shd w:val="clear" w:color="auto" w:fill="F2F2F2" w:themeFill="background1" w:themeFillShade="F2"/>
+          </w:tcPr>
+          <w:p>
+            <w:pPr>
+              <w:rPr>
+                <w:sz w:val="20"/>
+                <w:szCs w:val="20"/>
+              </w:rPr>
+            </w:pPr>
+            <w:r>
+              <w:rPr>
+                <w:sz w:val="20"/>
+                <w:szCs w:val="20"/>
+              </w:rPr>
+              <w:t>22</w:t>
+            </w:r>
+          </w:p>
+        </w:tc>
+        <w:tc>
+          <w:tcPr>
+            <w:tcW w:w="1400" w:type="dxa"/>
+            <w:shd w:val="clear" w:color="auto" w:fill="F2F2F2" w:themeFill="background1" w:themeFillShade="F2"/>
+          </w:tcPr>
+          <w:p>
+            <w:pPr>
+              <w:rPr>
+                <w:sz w:val="20"/>
+                <w:szCs w:val="20"/>
+              </w:rPr>
+            </w:pPr>
+            <w:r>
+              <w:rPr>
+                <w:sz w:val="20"/>
+                <w:szCs w:val="20"/>
+              </w:rPr>
+              <w:t>10.0.1.</w:t>
+            </w:r>
+            <w:r>
+              <w:rPr>
+                <w:sz w:val="20"/>
+                <w:szCs w:val="20"/>
+              </w:rPr>
+              <w:t>192</w:t>
+            </w:r>
+          </w:p>
+        </w:tc>
+        <w:tc>
+          <w:tcPr>
+            <w:tcW w:w="2348" w:type="dxa"/>
+            <w:shd w:val="clear" w:color="auto" w:fill="F2F2F2" w:themeFill="background1" w:themeFillShade="F2"/>
+          </w:tcPr>
+          <w:p>
+            <w:pPr>
+              <w:rPr>
+                <w:sz w:val="20"/>
+                <w:szCs w:val="20"/>
+              </w:rPr>
+            </w:pPr>
+            <w:r>
+              <w:rPr>
+                <w:sz w:val="20"/>
+                <w:szCs w:val="20"/>
+              </w:rPr>
+              <w:t>10.0.1.</w:t>
+            </w:r>
+            <w:r>
+              <w:rPr>
+                <w:sz w:val="20"/>
+                <w:szCs w:val="20"/>
+              </w:rPr>
+              <w:t xml:space="preserve">193 - </w:t>
+            </w:r>
+            <w:r>
+              <w:rPr>
+                <w:sz w:val="20"/>
+                <w:szCs w:val="20"/>
+              </w:rPr>
+              <w:t>10.0.1.</w:t>
+            </w:r>
+            <w:r>
+              <w:rPr>
+                <w:sz w:val="20"/>
+                <w:szCs w:val="20"/>
+              </w:rPr>
+              <w:t>254</w:t>
+            </w:r>
+          </w:p>
+        </w:tc>
+        <w:tc>
+          <w:tcPr>
+            <w:tcW w:w="1162" w:type="dxa"/>
+            <w:shd w:val="clear" w:color="auto" w:fill="F2F2F2" w:themeFill="background1" w:themeFillShade="F2"/>
+          </w:tcPr>
+          <w:p>
+            <w:pPr>
+              <w:rPr>
+                <w:sz w:val="20"/>
+                <w:szCs w:val="20"/>
+              </w:rPr>
+            </w:pPr>
+            <w:r>
+              <w:rPr>
+                <w:sz w:val="20"/>
+                <w:szCs w:val="20"/>
+              </w:rPr>
+              <w:t>10.0.1.</w:t>
+            </w:r>
+            <w:r>
+              <w:rPr>
+                <w:sz w:val="20"/>
+                <w:szCs w:val="20"/>
+              </w:rPr>
+              <w:t>255</w:t>
+            </w:r>
+          </w:p>
+        </w:tc>
+        <w:tc>
+          <w:tcPr>
+            <w:tcW w:w="850" w:type="dxa"/>
+            <w:shd w:val="clear" w:color="auto" w:fill="F2F2F2" w:themeFill="background1" w:themeFillShade="F2"/>
+          </w:tcPr>
+          <w:p>
+            <w:pPr>
+              <w:rPr>
+                <w:sz w:val="20"/>
+                <w:szCs w:val="20"/>
+              </w:rPr>
+            </w:pPr>
+            <w:r>
+              <w:rPr>
+                <w:sz w:val="20"/>
+                <w:szCs w:val="20"/>
+              </w:rPr>
+              <w:t>/26</w:t>
+            </w:r>
+          </w:p>
+        </w:tc>
+      </w:tr>
+      <w:tr>
+        <w:tc>
+          <w:tcPr>
+            <w:tcW w:w="1385" w:type="dxa"/>
+            <w:shd w:val="clear" w:color="auto" w:fill="D9D9D9" w:themeFill="background1" w:themeFillShade="D9"/>
+          </w:tcPr>
+          <w:p>
+            <w:pPr>
+              <w:rPr>
+                <w:sz w:val="20"/>
+                <w:szCs w:val="20"/>
+              </w:rPr>
+            </w:pPr>
+            <w:r>
+              <w:rPr>
+                <w:sz w:val="20"/>
+                <w:szCs w:val="20"/>
+              </w:rPr>
+              <w:t>Finance (20hosts)</w:t>
+            </w:r>
+          </w:p>
+        </w:tc>
+        <w:tc>
+          <w:tcPr>
+            <w:tcW w:w="1006" w:type="dxa"/>
+            <w:shd w:val="clear" w:color="auto" w:fill="D9D9D9" w:themeFill="background1" w:themeFillShade="D9"/>
+          </w:tcPr>
+          <w:p>
+            <w:pPr>
+              <w:rPr>
+                <w:sz w:val="20"/>
+                <w:szCs w:val="20"/>
+              </w:rPr>
+            </w:pPr>
+            <w:r>
+              <w:rPr>
+                <w:sz w:val="20"/>
+                <w:szCs w:val="20"/>
+              </w:rPr>
+              <w:t>30</w:t>
+            </w:r>
+          </w:p>
+        </w:tc>
+        <w:tc>
+          <w:tcPr>
+            <w:tcW w:w="865" w:type="dxa"/>
+            <w:shd w:val="clear" w:color="auto" w:fill="D9D9D9" w:themeFill="background1" w:themeFillShade="D9"/>
+          </w:tcPr>
+          <w:p>
+            <w:pPr>
+              <w:rPr>
+                <w:sz w:val="20"/>
+                <w:szCs w:val="20"/>
+              </w:rPr>
+            </w:pPr>
+            <w:r>
+              <w:rPr>
+                <w:sz w:val="20"/>
+                <w:szCs w:val="20"/>
+              </w:rPr>
+              <w:t>10</w:t>
+            </w:r>
+          </w:p>
+        </w:tc>
+        <w:tc>
+          <w:tcPr>
+            <w:tcW w:w="1400" w:type="dxa"/>
+            <w:shd w:val="clear" w:color="auto" w:fill="D9D9D9" w:themeFill="background1" w:themeFillShade="D9"/>
+          </w:tcPr>
+          <w:p>
+            <w:pPr>
+              <w:rPr>
+                <w:sz w:val="20"/>
+                <w:szCs w:val="20"/>
+              </w:rPr>
+            </w:pPr>
+            <w:r>
+              <w:rPr>
+                <w:sz w:val="20"/>
+                <w:szCs w:val="20"/>
+              </w:rPr>
+              <w:t>10.0.2.0</w:t>
+            </w:r>
+          </w:p>
+        </w:tc>
+        <w:tc>
+          <w:tcPr>
+            <w:tcW w:w="2348" w:type="dxa"/>
+            <w:shd w:val="clear" w:color="auto" w:fill="D9D9D9" w:themeFill="background1" w:themeFillShade="D9"/>
+          </w:tcPr>
+          <w:p>
+            <w:pPr>
+              <w:rPr>
+                <w:sz w:val="20"/>
+                <w:szCs w:val="20"/>
+              </w:rPr>
+            </w:pPr>
+            <w:r>
+              <w:rPr>
+                <w:sz w:val="20"/>
+                <w:szCs w:val="20"/>
+              </w:rPr>
+              <w:t>10.0.2.1 – 10.0.2.30</w:t>
+            </w:r>
+          </w:p>
+        </w:tc>
+        <w:tc>
+          <w:tcPr>
+            <w:tcW w:w="1162" w:type="dxa"/>
+            <w:shd w:val="clear" w:color="auto" w:fill="D9D9D9" w:themeFill="background1" w:themeFillShade="D9"/>
+          </w:tcPr>
+          <w:p>
+            <w:pPr>
+              <w:rPr>
+                <w:sz w:val="20"/>
+                <w:szCs w:val="20"/>
+              </w:rPr>
+            </w:pPr>
+            <w:r>
+              <w:rPr>
+                <w:sz w:val="20"/>
+                <w:szCs w:val="20"/>
+              </w:rPr>
+              <w:t>10.0.</w:t>
+            </w:r>
+            <w:r>
+              <w:rPr>
+                <w:sz w:val="20"/>
+                <w:szCs w:val="20"/>
+              </w:rPr>
+              <w:t>2.31</w:t>
+            </w:r>
+          </w:p>
+        </w:tc>
+        <w:tc>
+          <w:tcPr>
+            <w:tcW w:w="850" w:type="dxa"/>
+            <w:shd w:val="clear" w:color="auto" w:fill="D9D9D9" w:themeFill="background1" w:themeFillShade="D9"/>
+          </w:tcPr>
+          <w:p>
+            <w:pPr>
+              <w:rPr>
+                <w:sz w:val="20"/>
+                <w:szCs w:val="20"/>
+              </w:rPr>
+            </w:pPr>
+            <w:r>
+              <w:rPr>
+                <w:sz w:val="20"/>
+                <w:szCs w:val="20"/>
+              </w:rPr>
+              <w:t>/27</w:t>
+            </w:r>
+          </w:p>
+        </w:tc>
+      </w:tr>
+      <w:tr>
+        <w:tc>
+          <w:tcPr>
+            <w:tcW w:w="1385" w:type="dxa"/>
+          </w:tcPr>
+          <w:p>
+            <w:pPr>
+              <w:rPr>
+                <w:sz w:val="20"/>
+                <w:szCs w:val="20"/>
+              </w:rPr>
+            </w:pPr>
+          </w:p>
+        </w:tc>
+        <w:tc>
+          <w:tcPr>
+            <w:tcW w:w="1006" w:type="dxa"/>
+          </w:tcPr>
+          <w:p>
+            <w:pPr>
+              <w:rPr>
+                <w:sz w:val="20"/>
+                <w:szCs w:val="20"/>
+              </w:rPr>
+            </w:pPr>
+          </w:p>
+        </w:tc>
+        <w:tc>
+          <w:tcPr>
+            <w:tcW w:w="865" w:type="dxa"/>
+          </w:tcPr>
+          <w:p>
+            <w:pPr>
+              <w:rPr>
+                <w:sz w:val="20"/>
+                <w:szCs w:val="20"/>
+              </w:rPr>
+            </w:pPr>
+          </w:p>
+        </w:tc>
+        <w:tc>
+          <w:tcPr>
+            <w:tcW w:w="1400" w:type="dxa"/>
+          </w:tcPr>
+          <w:p>
+            <w:pPr>
+              <w:rPr>
+                <w:sz w:val="20"/>
+                <w:szCs w:val="20"/>
+              </w:rPr>
+            </w:pPr>
+          </w:p>
+        </w:tc>
+        <w:tc>
+          <w:tcPr>
+            <w:tcW w:w="2348" w:type="dxa"/>
+          </w:tcPr>
+          <w:p>
+            <w:pPr>
+              <w:rPr>
+                <w:sz w:val="20"/>
+                <w:szCs w:val="20"/>
+              </w:rPr>
+            </w:pPr>
+          </w:p>
+        </w:tc>
+        <w:tc>
+          <w:tcPr>
+            <w:tcW w:w="1162" w:type="dxa"/>
+          </w:tcPr>
+          <w:p>
+            <w:pPr>
+              <w:rPr>
+                <w:sz w:val="20"/>
+                <w:szCs w:val="20"/>
+              </w:rPr>
+            </w:pPr>
+          </w:p>
+        </w:tc>
+        <w:tc>
+          <w:tcPr>
+            <w:tcW w:w="850" w:type="dxa"/>
+          </w:tcPr>
+          <w:p>
+            <w:pPr>
+              <w:rPr>
+                <w:sz w:val="20"/>
+                <w:szCs w:val="20"/>
+              </w:rPr>
+            </w:pPr>
+          </w:p>
+        </w:tc>
+      </w:tr>
+    </w:tbl>
+    <w:p/>
     <w:p/>
     <w:sectPr>
       <w:pgSz w:w="11906" w:h="16838"/>
@@ -935,6 +2286,7 @@
   <w:style w:type="character" w:default="1" w:styleId="DefaultParagraphFont">
     <w:name w:val="Default Paragraph Font"/>
     <w:uiPriority w:val="1"/>
+    <w:semiHidden/>
     <w:unhideWhenUsed/>
   </w:style>
   <w:style w:type="table" w:default="1" w:styleId="TableNormal">
@@ -1247,6 +2599,25 @@
       <w:color w:val="0F4761" w:themeColor="accent1" w:themeShade="BF"/>
       <w:spacing w:val="5"/>
     </w:rPr>
+  </w:style>
+  <w:style w:type="table" w:styleId="TableGrid">
+    <w:name w:val="Table Grid"/>
+    <w:basedOn w:val="TableNormal"/>
+    <w:uiPriority w:val="39"/>
+    <w:rsid w:val="009A573B"/>
+    <w:pPr>
+      <w:spacing w:after="0" w:line="240" w:lineRule="auto"/>
+    </w:pPr>
+    <w:tblPr>
+      <w:tblBorders>
+        <w:top w:val="single" w:sz="4" w:space="0" w:color="auto"/>
+        <w:left w:val="single" w:sz="4" w:space="0" w:color="auto"/>
+        <w:bottom w:val="single" w:sz="4" w:space="0" w:color="auto"/>
+        <w:right w:val="single" w:sz="4" w:space="0" w:color="auto"/>
+        <w:insideH w:val="single" w:sz="4" w:space="0" w:color="auto"/>
+        <w:insideV w:val="single" w:sz="4" w:space="0" w:color="auto"/>
+      </w:tblBorders>
+    </w:tblPr>
   </w:style>
 </w:styles>
 </file>

</xml_diff>

<commit_message>
changed VLSM subnetting, provided explanation
</commit_message>
<xml_diff>
--- a/project plan.docx
+++ b/project plan.docx
@@ -14,12 +14,58 @@
           <w:ilvl w:val="0"/>
           <w:numId w:val="2"/>
         </w:numPr>
-      </w:pPr>
-      <w:r>
+        <w:rPr>
+          <w:b/>
+          <w:bCs/>
+        </w:rPr>
+      </w:pPr>
+      <w:r>
+        <w:rPr>
+          <w:b/>
+          <w:bCs/>
+        </w:rPr>
         <w:t xml:space="preserve">Production </w:t>
       </w:r>
       <w:r>
-        <w:t>200 (100 staff + 100 BYOD)</w:t>
+        <w:rPr>
+          <w:b/>
+          <w:bCs/>
+        </w:rPr>
+        <w:t>400</w:t>
+      </w:r>
+      <w:r>
+        <w:rPr>
+          <w:b/>
+          <w:bCs/>
+        </w:rPr>
+        <w:t xml:space="preserve"> </w:t>
+      </w:r>
+    </w:p>
+    <w:p>
+      <w:pPr>
+        <w:pStyle w:val="ListParagraph"/>
+        <w:numPr>
+          <w:ilvl w:val="1"/>
+          <w:numId w:val="2"/>
+        </w:numPr>
+      </w:pPr>
+      <w:r>
+        <w:t>(</w:t>
+      </w:r>
+      <w:r>
+        <w:t>100 staff  + BYOD + expansion)</w:t>
+      </w:r>
+    </w:p>
+    <w:p>
+      <w:pPr>
+        <w:pStyle w:val="ListParagraph"/>
+        <w:numPr>
+          <w:ilvl w:val="1"/>
+          <w:numId w:val="2"/>
+        </w:numPr>
+      </w:pPr>
+      <w:r>
+        <w:t>Very likely to grow. Largest growth expected</w:t>
       </w:r>
     </w:p>
     <w:p>
@@ -29,12 +75,57 @@
           <w:ilvl w:val="0"/>
           <w:numId w:val="2"/>
         </w:numPr>
-      </w:pPr>
-      <w:r>
+        <w:rPr>
+          <w:b/>
+          <w:bCs/>
+        </w:rPr>
+      </w:pPr>
+      <w:r>
+        <w:rPr>
+          <w:b/>
+          <w:bCs/>
+        </w:rPr>
         <w:t xml:space="preserve">Warehouse </w:t>
       </w:r>
       <w:r>
-        <w:t>40 (20 staff + 20 BYOD)</w:t>
+        <w:rPr>
+          <w:b/>
+          <w:bCs/>
+        </w:rPr>
+        <w:t>50</w:t>
+      </w:r>
+    </w:p>
+    <w:p>
+      <w:pPr>
+        <w:pStyle w:val="ListParagraph"/>
+        <w:numPr>
+          <w:ilvl w:val="1"/>
+          <w:numId w:val="2"/>
+        </w:numPr>
+      </w:pPr>
+      <w:r>
+        <w:t>(</w:t>
+      </w:r>
+      <w:r>
+        <w:t>20 staff + BYOD + expansion</w:t>
+      </w:r>
+      <w:r>
+        <w:t>)</w:t>
+      </w:r>
+    </w:p>
+    <w:p>
+      <w:pPr>
+        <w:pStyle w:val="ListParagraph"/>
+        <w:numPr>
+          <w:ilvl w:val="1"/>
+          <w:numId w:val="2"/>
+        </w:numPr>
+      </w:pPr>
+      <w:r>
+        <w:t>Not expected to grow</w:t>
+      </w:r>
+      <w:r>
+        <w:t xml:space="preserve"> too much, very stable department</w:t>
       </w:r>
     </w:p>
     <w:p>
@@ -44,12 +135,54 @@
           <w:ilvl w:val="0"/>
           <w:numId w:val="2"/>
         </w:numPr>
-      </w:pPr>
-      <w:r>
+        <w:rPr>
+          <w:b/>
+          <w:bCs/>
+        </w:rPr>
+      </w:pPr>
+      <w:r>
+        <w:rPr>
+          <w:b/>
+          <w:bCs/>
+        </w:rPr>
         <w:t xml:space="preserve">Sales &amp; marketing </w:t>
       </w:r>
       <w:r>
-        <w:t>40 (20 staff + 20 BYOD)</w:t>
+        <w:rPr>
+          <w:b/>
+          <w:bCs/>
+        </w:rPr>
+        <w:t>60</w:t>
+      </w:r>
+    </w:p>
+    <w:p>
+      <w:pPr>
+        <w:pStyle w:val="ListParagraph"/>
+        <w:numPr>
+          <w:ilvl w:val="1"/>
+          <w:numId w:val="2"/>
+        </w:numPr>
+      </w:pPr>
+      <w:r>
+        <w:t xml:space="preserve"> (</w:t>
+      </w:r>
+      <w:r>
+        <w:t>20staff + BYOD + expansion</w:t>
+      </w:r>
+      <w:r>
+        <w:t>)</w:t>
+      </w:r>
+    </w:p>
+    <w:p>
+      <w:pPr>
+        <w:pStyle w:val="ListParagraph"/>
+        <w:numPr>
+          <w:ilvl w:val="1"/>
+          <w:numId w:val="2"/>
+        </w:numPr>
+      </w:pPr>
+      <w:r>
+        <w:t>Medium growth, BYOD heavy</w:t>
       </w:r>
     </w:p>
     <w:p>
@@ -59,12 +192,57 @@
           <w:ilvl w:val="0"/>
           <w:numId w:val="2"/>
         </w:numPr>
-      </w:pPr>
-      <w:r>
+        <w:rPr>
+          <w:b/>
+          <w:bCs/>
+        </w:rPr>
+      </w:pPr>
+      <w:r>
+        <w:rPr>
+          <w:b/>
+          <w:bCs/>
+        </w:rPr>
         <w:t xml:space="preserve">Finance </w:t>
       </w:r>
       <w:r>
-        <w:t>20 (10 staff + 10 BYOD)</w:t>
+        <w:rPr>
+          <w:b/>
+          <w:bCs/>
+        </w:rPr>
+        <w:t>30</w:t>
+      </w:r>
+    </w:p>
+    <w:p>
+      <w:pPr>
+        <w:pStyle w:val="ListParagraph"/>
+        <w:numPr>
+          <w:ilvl w:val="1"/>
+          <w:numId w:val="2"/>
+        </w:numPr>
+      </w:pPr>
+      <w:r>
+        <w:t xml:space="preserve">(10 staff + </w:t>
+      </w:r>
+      <w:r>
+        <w:t>BYOD + expansion</w:t>
+      </w:r>
+      <w:r>
+        <w:t>)</w:t>
+      </w:r>
+    </w:p>
+    <w:p>
+      <w:pPr>
+        <w:pStyle w:val="ListParagraph"/>
+        <w:numPr>
+          <w:ilvl w:val="1"/>
+          <w:numId w:val="2"/>
+        </w:numPr>
+      </w:pPr>
+      <w:r>
+        <w:t>Not expected to drastically grow</w:t>
+      </w:r>
+      <w:r>
+        <w:t>, small &amp; stable</w:t>
       </w:r>
     </w:p>
     <w:p>
@@ -74,12 +252,51 @@
           <w:ilvl w:val="0"/>
           <w:numId w:val="2"/>
         </w:numPr>
-      </w:pPr>
-      <w:r>
+        <w:rPr>
+          <w:b/>
+          <w:bCs/>
+        </w:rPr>
+      </w:pPr>
+      <w:r>
+        <w:rPr>
+          <w:b/>
+          <w:bCs/>
+        </w:rPr>
         <w:t xml:space="preserve">R&amp;D </w:t>
       </w:r>
       <w:r>
-        <w:t>60 (30 staff + 30 BYOD)</w:t>
+        <w:rPr>
+          <w:b/>
+          <w:bCs/>
+        </w:rPr>
+        <w:t>100</w:t>
+      </w:r>
+    </w:p>
+    <w:p>
+      <w:pPr>
+        <w:pStyle w:val="ListParagraph"/>
+        <w:numPr>
+          <w:ilvl w:val="1"/>
+          <w:numId w:val="2"/>
+        </w:numPr>
+      </w:pPr>
+      <w:r>
+        <w:t>(</w:t>
+      </w:r>
+      <w:r>
+        <w:t>30 staff + BYOD + growth)</w:t>
+      </w:r>
+    </w:p>
+    <w:p>
+      <w:pPr>
+        <w:pStyle w:val="ListParagraph"/>
+        <w:numPr>
+          <w:ilvl w:val="1"/>
+          <w:numId w:val="2"/>
+        </w:numPr>
+      </w:pPr>
+      <w:r>
+        <w:t>Moderate expansion on a new product</w:t>
       </w:r>
     </w:p>
     <w:p>
@@ -89,12 +306,57 @@
           <w:ilvl w:val="0"/>
           <w:numId w:val="2"/>
         </w:numPr>
-      </w:pPr>
-      <w:r>
+        <w:rPr>
+          <w:b/>
+          <w:bCs/>
+        </w:rPr>
+      </w:pPr>
+      <w:r>
+        <w:rPr>
+          <w:b/>
+          <w:bCs/>
+        </w:rPr>
         <w:t xml:space="preserve">Management </w:t>
       </w:r>
       <w:r>
-        <w:t>60 (30 staff + 30 BYOD)</w:t>
+        <w:rPr>
+          <w:b/>
+          <w:bCs/>
+        </w:rPr>
+        <w:t>80</w:t>
+      </w:r>
+    </w:p>
+    <w:p>
+      <w:pPr>
+        <w:pStyle w:val="ListParagraph"/>
+        <w:numPr>
+          <w:ilvl w:val="1"/>
+          <w:numId w:val="2"/>
+        </w:numPr>
+      </w:pPr>
+      <w:r>
+        <w:t xml:space="preserve">(30 staff + </w:t>
+      </w:r>
+      <w:r>
+        <w:t>BYOD + expansion</w:t>
+      </w:r>
+      <w:r>
+        <w:t>)</w:t>
+      </w:r>
+    </w:p>
+    <w:p>
+      <w:pPr>
+        <w:pStyle w:val="ListParagraph"/>
+        <w:numPr>
+          <w:ilvl w:val="1"/>
+          <w:numId w:val="2"/>
+        </w:numPr>
+      </w:pPr>
+      <w:r>
+        <w:t>Never need more management :)</w:t>
+      </w:r>
+      <w:r>
+        <w:t xml:space="preserve"> – limited growth</w:t>
       </w:r>
     </w:p>
     <w:p>
@@ -115,55 +377,78 @@
       <w:tblPr>
         <w:tblStyle w:val="TableGrid"/>
         <w:tblW w:w="0" w:type="auto"/>
+        <w:tblLayout w:type="fixed"/>
         <w:tblLook w:val="04A0" w:firstRow="1" w:lastRow="0" w:firstColumn="1" w:lastColumn="0" w:noHBand="0" w:noVBand="1"/>
       </w:tblPr>
       <w:tblGrid>
-        <w:gridCol w:w="1385"/>
-        <w:gridCol w:w="1006"/>
-        <w:gridCol w:w="906"/>
-        <w:gridCol w:w="1393"/>
-        <w:gridCol w:w="2314"/>
-        <w:gridCol w:w="1162"/>
-        <w:gridCol w:w="850"/>
+        <w:gridCol w:w="1413"/>
+        <w:gridCol w:w="992"/>
+        <w:gridCol w:w="992"/>
+        <w:gridCol w:w="851"/>
+        <w:gridCol w:w="1227"/>
+        <w:gridCol w:w="1608"/>
+        <w:gridCol w:w="1216"/>
+        <w:gridCol w:w="717"/>
       </w:tblGrid>
       <w:tr>
         <w:tc>
           <w:tcPr>
-            <w:tcW w:w="1385" w:type="dxa"/>
-            <w:shd w:val="clear" w:color="auto" w:fill="F6C5AC" w:themeFill="accent2" w:themeFillTint="66"/>
-          </w:tcPr>
-          <w:p>
-            <w:pPr>
-              <w:rPr>
-                <w:sz w:val="20"/>
-                <w:szCs w:val="20"/>
-              </w:rPr>
-            </w:pPr>
-            <w:r>
-              <w:rPr>
-                <w:sz w:val="20"/>
-                <w:szCs w:val="20"/>
-              </w:rPr>
-              <w:t>Department</w:t>
-            </w:r>
-          </w:p>
-        </w:tc>
-        <w:tc>
-          <w:tcPr>
-            <w:tcW w:w="1006" w:type="dxa"/>
-            <w:shd w:val="clear" w:color="auto" w:fill="F6C5AC" w:themeFill="accent2" w:themeFillTint="66"/>
-          </w:tcPr>
-          <w:p>
-            <w:pPr>
-              <w:rPr>
-                <w:sz w:val="20"/>
-                <w:szCs w:val="20"/>
-              </w:rPr>
-            </w:pPr>
-            <w:r>
-              <w:rPr>
-                <w:sz w:val="20"/>
-                <w:szCs w:val="20"/>
+            <w:tcW w:w="1413" w:type="dxa"/>
+            <w:shd w:val="clear" w:color="auto" w:fill="FAE2D5" w:themeFill="accent2" w:themeFillTint="33"/>
+          </w:tcPr>
+          <w:p>
+            <w:pPr>
+              <w:rPr>
+                <w:sz w:val="18"/>
+                <w:szCs w:val="18"/>
+              </w:rPr>
+            </w:pPr>
+            <w:r>
+              <w:rPr>
+                <w:sz w:val="18"/>
+                <w:szCs w:val="18"/>
+              </w:rPr>
+              <w:t xml:space="preserve">Department </w:t>
+            </w:r>
+          </w:p>
+        </w:tc>
+        <w:tc>
+          <w:tcPr>
+            <w:tcW w:w="992" w:type="dxa"/>
+            <w:shd w:val="clear" w:color="auto" w:fill="FAE2D5" w:themeFill="accent2" w:themeFillTint="33"/>
+          </w:tcPr>
+          <w:p>
+            <w:pPr>
+              <w:rPr>
+                <w:sz w:val="18"/>
+                <w:szCs w:val="18"/>
+              </w:rPr>
+            </w:pPr>
+            <w:r>
+              <w:rPr>
+                <w:sz w:val="18"/>
+                <w:szCs w:val="18"/>
+              </w:rPr>
+              <w:t>Hosts needed</w:t>
+            </w:r>
+          </w:p>
+        </w:tc>
+        <w:tc>
+          <w:tcPr>
+            <w:tcW w:w="992" w:type="dxa"/>
+            <w:shd w:val="clear" w:color="auto" w:fill="FAE2D5" w:themeFill="accent2" w:themeFillTint="33"/>
+          </w:tcPr>
+          <w:p>
+            <w:pPr>
+              <w:rPr>
+                <w:sz w:val="18"/>
+                <w:szCs w:val="18"/>
+              </w:rPr>
+            </w:pPr>
+            <w:r>
+              <w:rPr>
+                <w:sz w:val="18"/>
+                <w:szCs w:val="18"/>
               </w:rPr>
               <w:t>Hosts available</w:t>
             </w:r>
@@ -171,20 +456,20 @@
         </w:tc>
         <w:tc>
           <w:tcPr>
-            <w:tcW w:w="865" w:type="dxa"/>
-            <w:shd w:val="clear" w:color="auto" w:fill="F6C5AC" w:themeFill="accent2" w:themeFillTint="66"/>
-          </w:tcPr>
-          <w:p>
-            <w:pPr>
-              <w:rPr>
-                <w:sz w:val="20"/>
-                <w:szCs w:val="20"/>
-              </w:rPr>
-            </w:pPr>
-            <w:r>
-              <w:rPr>
-                <w:sz w:val="20"/>
-                <w:szCs w:val="20"/>
+            <w:tcW w:w="851" w:type="dxa"/>
+            <w:shd w:val="clear" w:color="auto" w:fill="FAE2D5" w:themeFill="accent2" w:themeFillTint="33"/>
+          </w:tcPr>
+          <w:p>
+            <w:pPr>
+              <w:rPr>
+                <w:sz w:val="18"/>
+                <w:szCs w:val="18"/>
+              </w:rPr>
+            </w:pPr>
+            <w:r>
+              <w:rPr>
+                <w:sz w:val="18"/>
+                <w:szCs w:val="18"/>
               </w:rPr>
               <w:t>Unused Hosts</w:t>
             </w:r>
@@ -192,20 +477,20 @@
         </w:tc>
         <w:tc>
           <w:tcPr>
-            <w:tcW w:w="1400" w:type="dxa"/>
-            <w:shd w:val="clear" w:color="auto" w:fill="F6C5AC" w:themeFill="accent2" w:themeFillTint="66"/>
-          </w:tcPr>
-          <w:p>
-            <w:pPr>
-              <w:rPr>
-                <w:sz w:val="20"/>
-                <w:szCs w:val="20"/>
-              </w:rPr>
-            </w:pPr>
-            <w:r>
-              <w:rPr>
-                <w:sz w:val="20"/>
-                <w:szCs w:val="20"/>
+            <w:tcW w:w="1227" w:type="dxa"/>
+            <w:shd w:val="clear" w:color="auto" w:fill="FAE2D5" w:themeFill="accent2" w:themeFillTint="33"/>
+          </w:tcPr>
+          <w:p>
+            <w:pPr>
+              <w:rPr>
+                <w:sz w:val="18"/>
+                <w:szCs w:val="18"/>
+              </w:rPr>
+            </w:pPr>
+            <w:r>
+              <w:rPr>
+                <w:sz w:val="18"/>
+                <w:szCs w:val="18"/>
               </w:rPr>
               <w:t>Network ID</w:t>
             </w:r>
@@ -213,20 +498,20 @@
         </w:tc>
         <w:tc>
           <w:tcPr>
-            <w:tcW w:w="2348" w:type="dxa"/>
-            <w:shd w:val="clear" w:color="auto" w:fill="F6C5AC" w:themeFill="accent2" w:themeFillTint="66"/>
-          </w:tcPr>
-          <w:p>
-            <w:pPr>
-              <w:rPr>
-                <w:sz w:val="20"/>
-                <w:szCs w:val="20"/>
-              </w:rPr>
-            </w:pPr>
-            <w:r>
-              <w:rPr>
-                <w:sz w:val="20"/>
-                <w:szCs w:val="20"/>
+            <w:tcW w:w="1608" w:type="dxa"/>
+            <w:shd w:val="clear" w:color="auto" w:fill="FAE2D5" w:themeFill="accent2" w:themeFillTint="33"/>
+          </w:tcPr>
+          <w:p>
+            <w:pPr>
+              <w:rPr>
+                <w:sz w:val="18"/>
+                <w:szCs w:val="18"/>
+              </w:rPr>
+            </w:pPr>
+            <w:r>
+              <w:rPr>
+                <w:sz w:val="18"/>
+                <w:szCs w:val="18"/>
               </w:rPr>
               <w:t>Useable Hosts</w:t>
             </w:r>
@@ -234,20 +519,20 @@
         </w:tc>
         <w:tc>
           <w:tcPr>
-            <w:tcW w:w="1162" w:type="dxa"/>
-            <w:shd w:val="clear" w:color="auto" w:fill="F6C5AC" w:themeFill="accent2" w:themeFillTint="66"/>
-          </w:tcPr>
-          <w:p>
-            <w:pPr>
-              <w:rPr>
-                <w:sz w:val="20"/>
-                <w:szCs w:val="20"/>
-              </w:rPr>
-            </w:pPr>
-            <w:r>
-              <w:rPr>
-                <w:sz w:val="20"/>
-                <w:szCs w:val="20"/>
+            <w:tcW w:w="1216" w:type="dxa"/>
+            <w:shd w:val="clear" w:color="auto" w:fill="FAE2D5" w:themeFill="accent2" w:themeFillTint="33"/>
+          </w:tcPr>
+          <w:p>
+            <w:pPr>
+              <w:rPr>
+                <w:sz w:val="18"/>
+                <w:szCs w:val="18"/>
+              </w:rPr>
+            </w:pPr>
+            <w:r>
+              <w:rPr>
+                <w:sz w:val="18"/>
+                <w:szCs w:val="18"/>
               </w:rPr>
               <w:t>Broadcast ID</w:t>
             </w:r>
@@ -255,22 +540,22 @@
         </w:tc>
         <w:tc>
           <w:tcPr>
-            <w:tcW w:w="850" w:type="dxa"/>
-            <w:shd w:val="clear" w:color="auto" w:fill="F6C5AC" w:themeFill="accent2" w:themeFillTint="66"/>
-          </w:tcPr>
-          <w:p>
-            <w:pPr>
-              <w:rPr>
-                <w:sz w:val="20"/>
-                <w:szCs w:val="20"/>
-              </w:rPr>
-            </w:pPr>
-            <w:r>
-              <w:rPr>
-                <w:sz w:val="20"/>
-                <w:szCs w:val="20"/>
-              </w:rPr>
-              <w:t>Subnet Mask</w:t>
+            <w:tcW w:w="717" w:type="dxa"/>
+            <w:shd w:val="clear" w:color="auto" w:fill="FAE2D5" w:themeFill="accent2" w:themeFillTint="33"/>
+          </w:tcPr>
+          <w:p>
+            <w:pPr>
+              <w:rPr>
+                <w:sz w:val="18"/>
+                <w:szCs w:val="18"/>
+              </w:rPr>
+            </w:pPr>
+            <w:r>
+              <w:rPr>
+                <w:sz w:val="18"/>
+                <w:szCs w:val="18"/>
+              </w:rPr>
+              <w:t>Mask</w:t>
             </w:r>
           </w:p>
         </w:tc>
@@ -278,71 +563,87 @@
       <w:tr>
         <w:tc>
           <w:tcPr>
-            <w:tcW w:w="1385" w:type="dxa"/>
-            <w:shd w:val="clear" w:color="auto" w:fill="F2F2F2" w:themeFill="background1" w:themeFillShade="F2"/>
-          </w:tcPr>
-          <w:p>
-            <w:pPr>
-              <w:rPr>
-                <w:sz w:val="20"/>
-                <w:szCs w:val="20"/>
-              </w:rPr>
-            </w:pPr>
-            <w:r>
-              <w:rPr>
-                <w:sz w:val="20"/>
-                <w:szCs w:val="20"/>
-              </w:rPr>
-              <w:t>Production (200hosts)</w:t>
-            </w:r>
-          </w:p>
-        </w:tc>
-        <w:tc>
-          <w:tcPr>
-            <w:tcW w:w="1006" w:type="dxa"/>
-            <w:shd w:val="clear" w:color="auto" w:fill="F2F2F2" w:themeFill="background1" w:themeFillShade="F2"/>
-          </w:tcPr>
-          <w:p>
-            <w:pPr>
-              <w:rPr>
-                <w:sz w:val="20"/>
-                <w:szCs w:val="20"/>
-              </w:rPr>
-            </w:pPr>
-            <w:r>
-              <w:rPr>
-                <w:sz w:val="20"/>
-                <w:szCs w:val="20"/>
-              </w:rPr>
-              <w:t>254</w:t>
-            </w:r>
-          </w:p>
-        </w:tc>
-        <w:tc>
-          <w:tcPr>
-            <w:tcW w:w="865" w:type="dxa"/>
-            <w:shd w:val="clear" w:color="auto" w:fill="F2F2F2" w:themeFill="background1" w:themeFillShade="F2"/>
-          </w:tcPr>
-          <w:p>
-            <w:pPr>
-              <w:rPr>
-                <w:sz w:val="20"/>
-                <w:szCs w:val="20"/>
-              </w:rPr>
-            </w:pPr>
-            <w:r>
-              <w:rPr>
-                <w:sz w:val="20"/>
-                <w:szCs w:val="20"/>
-              </w:rPr>
-              <w:t>54</w:t>
-            </w:r>
-          </w:p>
-        </w:tc>
-        <w:tc>
-          <w:tcPr>
-            <w:tcW w:w="1400" w:type="dxa"/>
-            <w:shd w:val="clear" w:color="auto" w:fill="F2F2F2" w:themeFill="background1" w:themeFillShade="F2"/>
+            <w:tcW w:w="1413" w:type="dxa"/>
+          </w:tcPr>
+          <w:p>
+            <w:pPr>
+              <w:rPr>
+                <w:sz w:val="20"/>
+                <w:szCs w:val="20"/>
+              </w:rPr>
+            </w:pPr>
+            <w:r>
+              <w:rPr>
+                <w:sz w:val="20"/>
+                <w:szCs w:val="20"/>
+              </w:rPr>
+              <w:t>Production</w:t>
+            </w:r>
+          </w:p>
+        </w:tc>
+        <w:tc>
+          <w:tcPr>
+            <w:tcW w:w="992" w:type="dxa"/>
+          </w:tcPr>
+          <w:p>
+            <w:pPr>
+              <w:rPr>
+                <w:sz w:val="20"/>
+                <w:szCs w:val="20"/>
+              </w:rPr>
+            </w:pPr>
+            <w:r>
+              <w:rPr>
+                <w:sz w:val="20"/>
+                <w:szCs w:val="20"/>
+              </w:rPr>
+              <w:t>400</w:t>
+            </w:r>
+          </w:p>
+        </w:tc>
+        <w:tc>
+          <w:tcPr>
+            <w:tcW w:w="992" w:type="dxa"/>
+          </w:tcPr>
+          <w:p>
+            <w:pPr>
+              <w:rPr>
+                <w:sz w:val="20"/>
+                <w:szCs w:val="20"/>
+              </w:rPr>
+            </w:pPr>
+            <w:r>
+              <w:rPr>
+                <w:sz w:val="20"/>
+                <w:szCs w:val="20"/>
+              </w:rPr>
+              <w:t>510</w:t>
+            </w:r>
+          </w:p>
+        </w:tc>
+        <w:tc>
+          <w:tcPr>
+            <w:tcW w:w="851" w:type="dxa"/>
+          </w:tcPr>
+          <w:p>
+            <w:pPr>
+              <w:rPr>
+                <w:sz w:val="20"/>
+                <w:szCs w:val="20"/>
+              </w:rPr>
+            </w:pPr>
+            <w:r>
+              <w:rPr>
+                <w:sz w:val="20"/>
+                <w:szCs w:val="20"/>
+              </w:rPr>
+              <w:t>110</w:t>
+            </w:r>
+          </w:p>
+        </w:tc>
+        <w:tc>
+          <w:tcPr>
+            <w:tcW w:w="1227" w:type="dxa"/>
           </w:tcPr>
           <w:p>
             <w:pPr>
@@ -362,92 +663,61 @@
         </w:tc>
         <w:tc>
           <w:tcPr>
-            <w:tcW w:w="2348" w:type="dxa"/>
-            <w:shd w:val="clear" w:color="auto" w:fill="F2F2F2" w:themeFill="background1" w:themeFillShade="F2"/>
-          </w:tcPr>
-          <w:p>
-            <w:pPr>
-              <w:rPr>
-                <w:sz w:val="20"/>
-                <w:szCs w:val="20"/>
-              </w:rPr>
-            </w:pPr>
-            <w:r>
-              <w:rPr>
-                <w:sz w:val="20"/>
-                <w:szCs w:val="20"/>
-              </w:rPr>
-              <w:t>10.0.0.</w:t>
-            </w:r>
-            <w:r>
-              <w:rPr>
-                <w:sz w:val="20"/>
-                <w:szCs w:val="20"/>
-              </w:rPr>
-              <w:t xml:space="preserve">1 - </w:t>
-            </w:r>
-            <w:r>
-              <w:rPr>
-                <w:sz w:val="20"/>
-                <w:szCs w:val="20"/>
-              </w:rPr>
-              <w:t>10.0.0.</w:t>
-            </w:r>
-            <w:r>
-              <w:rPr>
-                <w:sz w:val="20"/>
-                <w:szCs w:val="20"/>
-              </w:rPr>
-              <w:t>254</w:t>
-            </w:r>
-          </w:p>
-        </w:tc>
-        <w:tc>
-          <w:tcPr>
-            <w:tcW w:w="1162" w:type="dxa"/>
-            <w:shd w:val="clear" w:color="auto" w:fill="F2F2F2" w:themeFill="background1" w:themeFillShade="F2"/>
-          </w:tcPr>
-          <w:p>
-            <w:pPr>
-              <w:rPr>
-                <w:sz w:val="20"/>
-                <w:szCs w:val="20"/>
-              </w:rPr>
-            </w:pPr>
-            <w:r>
-              <w:rPr>
-                <w:sz w:val="20"/>
-                <w:szCs w:val="20"/>
-              </w:rPr>
-              <w:t>10.0.0.</w:t>
-            </w:r>
-            <w:r>
-              <w:rPr>
-                <w:sz w:val="20"/>
-                <w:szCs w:val="20"/>
-              </w:rPr>
-              <w:t>255</w:t>
-            </w:r>
-          </w:p>
-        </w:tc>
-        <w:tc>
-          <w:tcPr>
-            <w:tcW w:w="850" w:type="dxa"/>
-            <w:shd w:val="clear" w:color="auto" w:fill="F2F2F2" w:themeFill="background1" w:themeFillShade="F2"/>
-          </w:tcPr>
-          <w:p>
-            <w:pPr>
-              <w:rPr>
-                <w:sz w:val="20"/>
-                <w:szCs w:val="20"/>
-              </w:rPr>
-            </w:pPr>
-            <w:r>
-              <w:rPr>
-                <w:sz w:val="20"/>
-                <w:szCs w:val="20"/>
-              </w:rPr>
-              <w:t>/24</w:t>
+            <w:tcW w:w="1608" w:type="dxa"/>
+          </w:tcPr>
+          <w:p>
+            <w:pPr>
+              <w:rPr>
+                <w:sz w:val="20"/>
+                <w:szCs w:val="20"/>
+              </w:rPr>
+            </w:pPr>
+            <w:r>
+              <w:rPr>
+                <w:sz w:val="20"/>
+                <w:szCs w:val="20"/>
+              </w:rPr>
+              <w:t>10.0.0.1 – 10.0.1.254</w:t>
+            </w:r>
+          </w:p>
+        </w:tc>
+        <w:tc>
+          <w:tcPr>
+            <w:tcW w:w="1216" w:type="dxa"/>
+          </w:tcPr>
+          <w:p>
+            <w:pPr>
+              <w:rPr>
+                <w:sz w:val="20"/>
+                <w:szCs w:val="20"/>
+              </w:rPr>
+            </w:pPr>
+            <w:r>
+              <w:rPr>
+                <w:sz w:val="20"/>
+                <w:szCs w:val="20"/>
+              </w:rPr>
+              <w:t>10.0.1.255</w:t>
+            </w:r>
+          </w:p>
+        </w:tc>
+        <w:tc>
+          <w:tcPr>
+            <w:tcW w:w="717" w:type="dxa"/>
+          </w:tcPr>
+          <w:p>
+            <w:pPr>
+              <w:rPr>
+                <w:sz w:val="20"/>
+                <w:szCs w:val="20"/>
+              </w:rPr>
+            </w:pPr>
+            <w:r>
+              <w:rPr>
+                <w:sz w:val="20"/>
+                <w:szCs w:val="20"/>
+              </w:rPr>
+              <w:t>/23</w:t>
             </w:r>
           </w:p>
         </w:tc>
@@ -455,29 +725,27 @@
       <w:tr>
         <w:tc>
           <w:tcPr>
-            <w:tcW w:w="1385" w:type="dxa"/>
-            <w:shd w:val="clear" w:color="auto" w:fill="D9D9D9" w:themeFill="background1" w:themeFillShade="D9"/>
-          </w:tcPr>
-          <w:p>
-            <w:pPr>
-              <w:rPr>
-                <w:sz w:val="20"/>
-                <w:szCs w:val="20"/>
-              </w:rPr>
-            </w:pPr>
-            <w:r>
-              <w:rPr>
-                <w:sz w:val="20"/>
-                <w:szCs w:val="20"/>
-              </w:rPr>
-              <w:t>Management (60hosts)</w:t>
-            </w:r>
-          </w:p>
-        </w:tc>
-        <w:tc>
-          <w:tcPr>
-            <w:tcW w:w="1006" w:type="dxa"/>
-            <w:shd w:val="clear" w:color="auto" w:fill="D9D9D9" w:themeFill="background1" w:themeFillShade="D9"/>
+            <w:tcW w:w="1413" w:type="dxa"/>
+          </w:tcPr>
+          <w:p>
+            <w:pPr>
+              <w:rPr>
+                <w:sz w:val="20"/>
+                <w:szCs w:val="20"/>
+              </w:rPr>
+            </w:pPr>
+            <w:r>
+              <w:rPr>
+                <w:sz w:val="20"/>
+                <w:szCs w:val="20"/>
+              </w:rPr>
+              <w:t>R&amp;D</w:t>
+            </w:r>
+          </w:p>
+        </w:tc>
+        <w:tc>
+          <w:tcPr>
+            <w:tcW w:w="992" w:type="dxa"/>
           </w:tcPr>
           <w:p>
             <w:pPr>
@@ -492,14 +760,13 @@
                 <w:sz w:val="20"/>
                 <w:szCs w:val="20"/>
               </w:rPr>
-              <w:t>62</w:t>
-            </w:r>
-          </w:p>
-        </w:tc>
-        <w:tc>
-          <w:tcPr>
-            <w:tcW w:w="865" w:type="dxa"/>
-            <w:shd w:val="clear" w:color="auto" w:fill="D9D9D9" w:themeFill="background1" w:themeFillShade="D9"/>
+              <w:t>100</w:t>
+            </w:r>
+          </w:p>
+        </w:tc>
+        <w:tc>
+          <w:tcPr>
+            <w:tcW w:w="992" w:type="dxa"/>
           </w:tcPr>
           <w:p>
             <w:pPr>
@@ -514,14 +781,13 @@
                 <w:sz w:val="20"/>
                 <w:szCs w:val="20"/>
               </w:rPr>
-              <w:t>2</w:t>
-            </w:r>
-          </w:p>
-        </w:tc>
-        <w:tc>
-          <w:tcPr>
-            <w:tcW w:w="1400" w:type="dxa"/>
-            <w:shd w:val="clear" w:color="auto" w:fill="D9D9D9" w:themeFill="background1" w:themeFillShade="D9"/>
+              <w:t>126</w:t>
+            </w:r>
+          </w:p>
+        </w:tc>
+        <w:tc>
+          <w:tcPr>
+            <w:tcW w:w="851" w:type="dxa"/>
           </w:tcPr>
           <w:p>
             <w:pPr>
@@ -536,98 +802,88 @@
                 <w:sz w:val="20"/>
                 <w:szCs w:val="20"/>
               </w:rPr>
-              <w:t>10.0.1.0</w:t>
-            </w:r>
-          </w:p>
-        </w:tc>
-        <w:tc>
-          <w:tcPr>
-            <w:tcW w:w="2348" w:type="dxa"/>
-            <w:shd w:val="clear" w:color="auto" w:fill="D9D9D9" w:themeFill="background1" w:themeFillShade="D9"/>
-          </w:tcPr>
-          <w:p>
-            <w:pPr>
-              <w:rPr>
-                <w:sz w:val="20"/>
-                <w:szCs w:val="20"/>
-              </w:rPr>
-            </w:pPr>
-            <w:r>
-              <w:rPr>
-                <w:sz w:val="20"/>
-                <w:szCs w:val="20"/>
-              </w:rPr>
-              <w:t>10.0.1.</w:t>
-            </w:r>
-            <w:r>
-              <w:rPr>
-                <w:sz w:val="20"/>
-                <w:szCs w:val="20"/>
-              </w:rPr>
-              <w:t xml:space="preserve">1 - </w:t>
-            </w:r>
-            <w:r>
-              <w:rPr>
-                <w:sz w:val="20"/>
-                <w:szCs w:val="20"/>
-              </w:rPr>
-              <w:t>10.0.1.</w:t>
-            </w:r>
-            <w:r>
-              <w:rPr>
-                <w:sz w:val="20"/>
-                <w:szCs w:val="20"/>
-              </w:rPr>
-              <w:t>62</w:t>
-            </w:r>
-          </w:p>
-        </w:tc>
-        <w:tc>
-          <w:tcPr>
-            <w:tcW w:w="1162" w:type="dxa"/>
-            <w:shd w:val="clear" w:color="auto" w:fill="D9D9D9" w:themeFill="background1" w:themeFillShade="D9"/>
-          </w:tcPr>
-          <w:p>
-            <w:pPr>
-              <w:rPr>
-                <w:sz w:val="20"/>
-                <w:szCs w:val="20"/>
-              </w:rPr>
-            </w:pPr>
-            <w:r>
-              <w:rPr>
-                <w:sz w:val="20"/>
-                <w:szCs w:val="20"/>
-              </w:rPr>
-              <w:t>10.0.1.</w:t>
-            </w:r>
-            <w:r>
-              <w:rPr>
-                <w:sz w:val="20"/>
-                <w:szCs w:val="20"/>
-              </w:rPr>
-              <w:t>63</w:t>
-            </w:r>
-          </w:p>
-        </w:tc>
-        <w:tc>
-          <w:tcPr>
-            <w:tcW w:w="850" w:type="dxa"/>
-            <w:shd w:val="clear" w:color="auto" w:fill="D9D9D9" w:themeFill="background1" w:themeFillShade="D9"/>
-          </w:tcPr>
-          <w:p>
-            <w:pPr>
-              <w:rPr>
-                <w:sz w:val="20"/>
-                <w:szCs w:val="20"/>
-              </w:rPr>
-            </w:pPr>
-            <w:r>
-              <w:rPr>
-                <w:sz w:val="20"/>
-                <w:szCs w:val="20"/>
-              </w:rPr>
-              <w:t>/26</w:t>
+              <w:t>26</w:t>
+            </w:r>
+          </w:p>
+        </w:tc>
+        <w:tc>
+          <w:tcPr>
+            <w:tcW w:w="1227" w:type="dxa"/>
+          </w:tcPr>
+          <w:p>
+            <w:pPr>
+              <w:ind w:left="720" w:hanging="720"/>
+              <w:rPr>
+                <w:sz w:val="20"/>
+                <w:szCs w:val="20"/>
+              </w:rPr>
+            </w:pPr>
+            <w:r>
+              <w:rPr>
+                <w:sz w:val="20"/>
+                <w:szCs w:val="20"/>
+              </w:rPr>
+              <w:t>10.0.2.0</w:t>
+            </w:r>
+          </w:p>
+        </w:tc>
+        <w:tc>
+          <w:tcPr>
+            <w:tcW w:w="1608" w:type="dxa"/>
+          </w:tcPr>
+          <w:p>
+            <w:pPr>
+              <w:rPr>
+                <w:sz w:val="20"/>
+                <w:szCs w:val="20"/>
+              </w:rPr>
+            </w:pPr>
+            <w:r>
+              <w:rPr>
+                <w:sz w:val="20"/>
+                <w:szCs w:val="20"/>
+              </w:rPr>
+              <w:t>10.0.2.1 – 10.0.2.126</w:t>
+            </w:r>
+          </w:p>
+        </w:tc>
+        <w:tc>
+          <w:tcPr>
+            <w:tcW w:w="1216" w:type="dxa"/>
+          </w:tcPr>
+          <w:p>
+            <w:pPr>
+              <w:rPr>
+                <w:sz w:val="20"/>
+                <w:szCs w:val="20"/>
+              </w:rPr>
+            </w:pPr>
+            <w:r>
+              <w:rPr>
+                <w:sz w:val="20"/>
+                <w:szCs w:val="20"/>
+              </w:rPr>
+              <w:t>10.0.2.127</w:t>
+            </w:r>
+          </w:p>
+        </w:tc>
+        <w:tc>
+          <w:tcPr>
+            <w:tcW w:w="717" w:type="dxa"/>
+          </w:tcPr>
+          <w:p>
+            <w:pPr>
+              <w:rPr>
+                <w:sz w:val="20"/>
+                <w:szCs w:val="20"/>
+              </w:rPr>
+            </w:pPr>
+            <w:r>
+              <w:rPr>
+                <w:sz w:val="20"/>
+                <w:szCs w:val="20"/>
+              </w:rPr>
+              <w:t>/25</w:t>
             </w:r>
           </w:p>
         </w:tc>
@@ -635,128 +891,55 @@
       <w:tr>
         <w:tc>
           <w:tcPr>
-            <w:tcW w:w="1385" w:type="dxa"/>
-            <w:shd w:val="clear" w:color="auto" w:fill="F2F2F2" w:themeFill="background1" w:themeFillShade="F2"/>
-          </w:tcPr>
-          <w:p>
-            <w:pPr>
-              <w:rPr>
-                <w:sz w:val="20"/>
-                <w:szCs w:val="20"/>
-              </w:rPr>
-            </w:pPr>
-            <w:r>
-              <w:rPr>
-                <w:sz w:val="20"/>
-                <w:szCs w:val="20"/>
-              </w:rPr>
-              <w:t>R&amp;D (60hosts)</w:t>
-            </w:r>
-          </w:p>
-        </w:tc>
-        <w:tc>
-          <w:tcPr>
-            <w:tcW w:w="1006" w:type="dxa"/>
-            <w:shd w:val="clear" w:color="auto" w:fill="F2F2F2" w:themeFill="background1" w:themeFillShade="F2"/>
-          </w:tcPr>
-          <w:p>
-            <w:pPr>
-              <w:rPr>
-                <w:sz w:val="20"/>
-                <w:szCs w:val="20"/>
-              </w:rPr>
-            </w:pPr>
-            <w:r>
-              <w:rPr>
-                <w:sz w:val="20"/>
-                <w:szCs w:val="20"/>
-              </w:rPr>
-              <w:t>62</w:t>
-            </w:r>
-          </w:p>
-        </w:tc>
-        <w:tc>
-          <w:tcPr>
-            <w:tcW w:w="865" w:type="dxa"/>
-            <w:shd w:val="clear" w:color="auto" w:fill="F2F2F2" w:themeFill="background1" w:themeFillShade="F2"/>
-          </w:tcPr>
-          <w:p>
-            <w:pPr>
-              <w:rPr>
-                <w:sz w:val="20"/>
-                <w:szCs w:val="20"/>
-              </w:rPr>
-            </w:pPr>
-            <w:r>
-              <w:rPr>
-                <w:sz w:val="20"/>
-                <w:szCs w:val="20"/>
-              </w:rPr>
-              <w:t>2</w:t>
-            </w:r>
-          </w:p>
-        </w:tc>
-        <w:tc>
-          <w:tcPr>
-            <w:tcW w:w="1400" w:type="dxa"/>
-            <w:shd w:val="clear" w:color="auto" w:fill="F2F2F2" w:themeFill="background1" w:themeFillShade="F2"/>
-          </w:tcPr>
-          <w:p>
-            <w:pPr>
-              <w:rPr>
-                <w:sz w:val="20"/>
-                <w:szCs w:val="20"/>
-              </w:rPr>
-            </w:pPr>
-            <w:r>
-              <w:rPr>
-                <w:sz w:val="20"/>
-                <w:szCs w:val="20"/>
-              </w:rPr>
-              <w:t>10.0.1.</w:t>
-            </w:r>
-            <w:r>
-              <w:rPr>
-                <w:sz w:val="20"/>
-                <w:szCs w:val="20"/>
-              </w:rPr>
-              <w:t>64</w:t>
-            </w:r>
-          </w:p>
-        </w:tc>
-        <w:tc>
-          <w:tcPr>
-            <w:tcW w:w="2348" w:type="dxa"/>
-            <w:shd w:val="clear" w:color="auto" w:fill="F2F2F2" w:themeFill="background1" w:themeFillShade="F2"/>
-          </w:tcPr>
-          <w:p>
-            <w:pPr>
-              <w:rPr>
-                <w:sz w:val="20"/>
-                <w:szCs w:val="20"/>
-              </w:rPr>
-            </w:pPr>
-            <w:r>
-              <w:rPr>
-                <w:sz w:val="20"/>
-                <w:szCs w:val="20"/>
-              </w:rPr>
-              <w:t>10.0.1</w:t>
-            </w:r>
-            <w:r>
-              <w:rPr>
-                <w:sz w:val="20"/>
-                <w:szCs w:val="20"/>
-              </w:rPr>
-              <w:t xml:space="preserve">.65 - </w:t>
-            </w:r>
-            <w:r>
-              <w:rPr>
-                <w:sz w:val="20"/>
-                <w:szCs w:val="20"/>
-              </w:rPr>
-              <w:t>10.0.1.</w:t>
-            </w:r>
+            <w:tcW w:w="1413" w:type="dxa"/>
+          </w:tcPr>
+          <w:p>
+            <w:pPr>
+              <w:rPr>
+                <w:sz w:val="20"/>
+                <w:szCs w:val="20"/>
+              </w:rPr>
+            </w:pPr>
+            <w:r>
+              <w:rPr>
+                <w:sz w:val="20"/>
+                <w:szCs w:val="20"/>
+              </w:rPr>
+              <w:t>Management</w:t>
+            </w:r>
+          </w:p>
+        </w:tc>
+        <w:tc>
+          <w:tcPr>
+            <w:tcW w:w="992" w:type="dxa"/>
+          </w:tcPr>
+          <w:p>
+            <w:pPr>
+              <w:rPr>
+                <w:sz w:val="20"/>
+                <w:szCs w:val="20"/>
+              </w:rPr>
+            </w:pPr>
+            <w:r>
+              <w:rPr>
+                <w:sz w:val="20"/>
+                <w:szCs w:val="20"/>
+              </w:rPr>
+              <w:t>80</w:t>
+            </w:r>
+          </w:p>
+        </w:tc>
+        <w:tc>
+          <w:tcPr>
+            <w:tcW w:w="992" w:type="dxa"/>
+          </w:tcPr>
+          <w:p>
+            <w:pPr>
+              <w:rPr>
+                <w:sz w:val="20"/>
+                <w:szCs w:val="20"/>
+              </w:rPr>
+            </w:pPr>
             <w:r>
               <w:rPr>
                 <w:sz w:val="20"/>
@@ -768,50 +951,101 @@
         </w:tc>
         <w:tc>
           <w:tcPr>
-            <w:tcW w:w="1162" w:type="dxa"/>
-            <w:shd w:val="clear" w:color="auto" w:fill="F2F2F2" w:themeFill="background1" w:themeFillShade="F2"/>
-          </w:tcPr>
-          <w:p>
-            <w:pPr>
-              <w:rPr>
-                <w:sz w:val="20"/>
-                <w:szCs w:val="20"/>
-              </w:rPr>
-            </w:pPr>
-            <w:r>
-              <w:rPr>
-                <w:sz w:val="20"/>
-                <w:szCs w:val="20"/>
-              </w:rPr>
-              <w:t>10.0.1.</w:t>
-            </w:r>
-            <w:r>
-              <w:rPr>
-                <w:sz w:val="20"/>
-                <w:szCs w:val="20"/>
-              </w:rPr>
-              <w:t>127</w:t>
-            </w:r>
-          </w:p>
-        </w:tc>
-        <w:tc>
-          <w:tcPr>
-            <w:tcW w:w="850" w:type="dxa"/>
-            <w:shd w:val="clear" w:color="auto" w:fill="F2F2F2" w:themeFill="background1" w:themeFillShade="F2"/>
-          </w:tcPr>
-          <w:p>
-            <w:pPr>
-              <w:rPr>
-                <w:sz w:val="20"/>
-                <w:szCs w:val="20"/>
-              </w:rPr>
-            </w:pPr>
-            <w:r>
-              <w:rPr>
-                <w:sz w:val="20"/>
-                <w:szCs w:val="20"/>
-              </w:rPr>
-              <w:t>/26</w:t>
+            <w:tcW w:w="851" w:type="dxa"/>
+          </w:tcPr>
+          <w:p>
+            <w:pPr>
+              <w:rPr>
+                <w:sz w:val="20"/>
+                <w:szCs w:val="20"/>
+              </w:rPr>
+            </w:pPr>
+            <w:r>
+              <w:rPr>
+                <w:sz w:val="20"/>
+                <w:szCs w:val="20"/>
+              </w:rPr>
+              <w:t>46</w:t>
+            </w:r>
+          </w:p>
+        </w:tc>
+        <w:tc>
+          <w:tcPr>
+            <w:tcW w:w="1227" w:type="dxa"/>
+          </w:tcPr>
+          <w:p>
+            <w:pPr>
+              <w:rPr>
+                <w:sz w:val="20"/>
+                <w:szCs w:val="20"/>
+              </w:rPr>
+            </w:pPr>
+            <w:r>
+              <w:rPr>
+                <w:sz w:val="20"/>
+                <w:szCs w:val="20"/>
+              </w:rPr>
+              <w:t>10.0.2.128</w:t>
+            </w:r>
+          </w:p>
+        </w:tc>
+        <w:tc>
+          <w:tcPr>
+            <w:tcW w:w="1608" w:type="dxa"/>
+          </w:tcPr>
+          <w:p>
+            <w:pPr>
+              <w:rPr>
+                <w:sz w:val="20"/>
+                <w:szCs w:val="20"/>
+              </w:rPr>
+            </w:pPr>
+            <w:r>
+              <w:rPr>
+                <w:sz w:val="20"/>
+                <w:szCs w:val="20"/>
+              </w:rPr>
+              <w:t>10.0.2.129 – 10.0.2.254</w:t>
+            </w:r>
+          </w:p>
+        </w:tc>
+        <w:tc>
+          <w:tcPr>
+            <w:tcW w:w="1216" w:type="dxa"/>
+          </w:tcPr>
+          <w:p>
+            <w:pPr>
+              <w:rPr>
+                <w:sz w:val="20"/>
+                <w:szCs w:val="20"/>
+              </w:rPr>
+            </w:pPr>
+            <w:r>
+              <w:rPr>
+                <w:sz w:val="20"/>
+                <w:szCs w:val="20"/>
+              </w:rPr>
+              <w:t>10.0.2.255</w:t>
+            </w:r>
+          </w:p>
+        </w:tc>
+        <w:tc>
+          <w:tcPr>
+            <w:tcW w:w="717" w:type="dxa"/>
+          </w:tcPr>
+          <w:p>
+            <w:pPr>
+              <w:rPr>
+                <w:sz w:val="20"/>
+                <w:szCs w:val="20"/>
+              </w:rPr>
+            </w:pPr>
+            <w:r>
+              <w:rPr>
+                <w:sz w:val="20"/>
+                <w:szCs w:val="20"/>
+              </w:rPr>
+              <w:t>/25</w:t>
             </w:r>
           </w:p>
         </w:tc>
@@ -819,29 +1053,47 @@
       <w:tr>
         <w:tc>
           <w:tcPr>
-            <w:tcW w:w="1385" w:type="dxa"/>
-            <w:shd w:val="clear" w:color="auto" w:fill="D9D9D9" w:themeFill="background1" w:themeFillShade="D9"/>
-          </w:tcPr>
-          <w:p>
-            <w:pPr>
-              <w:rPr>
-                <w:sz w:val="20"/>
-                <w:szCs w:val="20"/>
-              </w:rPr>
-            </w:pPr>
-            <w:r>
-              <w:rPr>
-                <w:sz w:val="20"/>
-                <w:szCs w:val="20"/>
-              </w:rPr>
-              <w:t>Sales (40hosts)</w:t>
-            </w:r>
-          </w:p>
-        </w:tc>
-        <w:tc>
-          <w:tcPr>
-            <w:tcW w:w="1006" w:type="dxa"/>
-            <w:shd w:val="clear" w:color="auto" w:fill="D9D9D9" w:themeFill="background1" w:themeFillShade="D9"/>
+            <w:tcW w:w="1413" w:type="dxa"/>
+          </w:tcPr>
+          <w:p>
+            <w:pPr>
+              <w:rPr>
+                <w:sz w:val="20"/>
+                <w:szCs w:val="20"/>
+              </w:rPr>
+            </w:pPr>
+            <w:r>
+              <w:rPr>
+                <w:sz w:val="20"/>
+                <w:szCs w:val="20"/>
+              </w:rPr>
+              <w:t>Sales</w:t>
+            </w:r>
+          </w:p>
+        </w:tc>
+        <w:tc>
+          <w:tcPr>
+            <w:tcW w:w="992" w:type="dxa"/>
+          </w:tcPr>
+          <w:p>
+            <w:pPr>
+              <w:rPr>
+                <w:sz w:val="20"/>
+                <w:szCs w:val="20"/>
+              </w:rPr>
+            </w:pPr>
+            <w:r>
+              <w:rPr>
+                <w:sz w:val="20"/>
+                <w:szCs w:val="20"/>
+              </w:rPr>
+              <w:t>60</w:t>
+            </w:r>
+          </w:p>
+        </w:tc>
+        <w:tc>
+          <w:tcPr>
+            <w:tcW w:w="992" w:type="dxa"/>
           </w:tcPr>
           <w:p>
             <w:pPr>
@@ -861,127 +1113,87 @@
         </w:tc>
         <w:tc>
           <w:tcPr>
-            <w:tcW w:w="865" w:type="dxa"/>
-            <w:shd w:val="clear" w:color="auto" w:fill="D9D9D9" w:themeFill="background1" w:themeFillShade="D9"/>
-          </w:tcPr>
-          <w:p>
-            <w:pPr>
-              <w:rPr>
-                <w:sz w:val="20"/>
-                <w:szCs w:val="20"/>
-              </w:rPr>
-            </w:pPr>
-            <w:r>
-              <w:rPr>
-                <w:sz w:val="20"/>
-                <w:szCs w:val="20"/>
-              </w:rPr>
-              <w:t>22</w:t>
-            </w:r>
-          </w:p>
-        </w:tc>
-        <w:tc>
-          <w:tcPr>
-            <w:tcW w:w="1400" w:type="dxa"/>
-            <w:shd w:val="clear" w:color="auto" w:fill="D9D9D9" w:themeFill="background1" w:themeFillShade="D9"/>
-          </w:tcPr>
-          <w:p>
-            <w:pPr>
-              <w:rPr>
-                <w:sz w:val="20"/>
-                <w:szCs w:val="20"/>
-              </w:rPr>
-            </w:pPr>
-            <w:r>
-              <w:rPr>
-                <w:sz w:val="20"/>
-                <w:szCs w:val="20"/>
-              </w:rPr>
-              <w:t>10.0.1.</w:t>
-            </w:r>
-            <w:r>
-              <w:rPr>
-                <w:sz w:val="20"/>
-                <w:szCs w:val="20"/>
-              </w:rPr>
-              <w:t>128</w:t>
-            </w:r>
-          </w:p>
-        </w:tc>
-        <w:tc>
-          <w:tcPr>
-            <w:tcW w:w="2348" w:type="dxa"/>
-            <w:shd w:val="clear" w:color="auto" w:fill="D9D9D9" w:themeFill="background1" w:themeFillShade="D9"/>
-          </w:tcPr>
-          <w:p>
-            <w:pPr>
-              <w:rPr>
-                <w:sz w:val="20"/>
-                <w:szCs w:val="20"/>
-              </w:rPr>
-            </w:pPr>
-            <w:r>
-              <w:rPr>
-                <w:sz w:val="20"/>
-                <w:szCs w:val="20"/>
-              </w:rPr>
-              <w:t>10.0.1.</w:t>
-            </w:r>
-            <w:r>
-              <w:rPr>
-                <w:sz w:val="20"/>
-                <w:szCs w:val="20"/>
-              </w:rPr>
-              <w:t xml:space="preserve">129 - </w:t>
-            </w:r>
-            <w:r>
-              <w:rPr>
-                <w:sz w:val="20"/>
-                <w:szCs w:val="20"/>
-              </w:rPr>
-              <w:t>10.0.1.</w:t>
-            </w:r>
-            <w:r>
-              <w:rPr>
-                <w:sz w:val="20"/>
-                <w:szCs w:val="20"/>
-              </w:rPr>
-              <w:t>190</w:t>
-            </w:r>
-          </w:p>
-        </w:tc>
-        <w:tc>
-          <w:tcPr>
-            <w:tcW w:w="1162" w:type="dxa"/>
-            <w:shd w:val="clear" w:color="auto" w:fill="D9D9D9" w:themeFill="background1" w:themeFillShade="D9"/>
-          </w:tcPr>
-          <w:p>
-            <w:pPr>
-              <w:rPr>
-                <w:sz w:val="20"/>
-                <w:szCs w:val="20"/>
-              </w:rPr>
-            </w:pPr>
-            <w:r>
-              <w:rPr>
-                <w:sz w:val="20"/>
-                <w:szCs w:val="20"/>
-              </w:rPr>
-              <w:t>10.0.1.</w:t>
-            </w:r>
-            <w:r>
-              <w:rPr>
-                <w:sz w:val="20"/>
-                <w:szCs w:val="20"/>
-              </w:rPr>
-              <w:t>191</w:t>
-            </w:r>
-          </w:p>
-        </w:tc>
-        <w:tc>
-          <w:tcPr>
-            <w:tcW w:w="850" w:type="dxa"/>
-            <w:shd w:val="clear" w:color="auto" w:fill="D9D9D9" w:themeFill="background1" w:themeFillShade="D9"/>
+            <w:tcW w:w="851" w:type="dxa"/>
+          </w:tcPr>
+          <w:p>
+            <w:pPr>
+              <w:rPr>
+                <w:sz w:val="20"/>
+                <w:szCs w:val="20"/>
+              </w:rPr>
+            </w:pPr>
+            <w:r>
+              <w:rPr>
+                <w:sz w:val="20"/>
+                <w:szCs w:val="20"/>
+              </w:rPr>
+              <w:t>2</w:t>
+            </w:r>
+          </w:p>
+        </w:tc>
+        <w:tc>
+          <w:tcPr>
+            <w:tcW w:w="1227" w:type="dxa"/>
+          </w:tcPr>
+          <w:p>
+            <w:pPr>
+              <w:rPr>
+                <w:sz w:val="20"/>
+                <w:szCs w:val="20"/>
+              </w:rPr>
+            </w:pPr>
+            <w:r>
+              <w:rPr>
+                <w:sz w:val="20"/>
+                <w:szCs w:val="20"/>
+              </w:rPr>
+              <w:t>10.0.3.0</w:t>
+            </w:r>
+          </w:p>
+        </w:tc>
+        <w:tc>
+          <w:tcPr>
+            <w:tcW w:w="1608" w:type="dxa"/>
+          </w:tcPr>
+          <w:p>
+            <w:pPr>
+              <w:rPr>
+                <w:sz w:val="20"/>
+                <w:szCs w:val="20"/>
+              </w:rPr>
+            </w:pPr>
+            <w:r>
+              <w:rPr>
+                <w:sz w:val="20"/>
+                <w:szCs w:val="20"/>
+              </w:rPr>
+              <w:t>10.0.3.1 – 10.0.3.62</w:t>
+            </w:r>
+          </w:p>
+        </w:tc>
+        <w:tc>
+          <w:tcPr>
+            <w:tcW w:w="1216" w:type="dxa"/>
+          </w:tcPr>
+          <w:p>
+            <w:pPr>
+              <w:rPr>
+                <w:sz w:val="20"/>
+                <w:szCs w:val="20"/>
+              </w:rPr>
+            </w:pPr>
+            <w:r>
+              <w:rPr>
+                <w:sz w:val="20"/>
+                <w:szCs w:val="20"/>
+              </w:rPr>
+              <w:t>10.0.3.63</w:t>
+            </w:r>
+          </w:p>
+        </w:tc>
+        <w:tc>
+          <w:tcPr>
+            <w:tcW w:w="717" w:type="dxa"/>
           </w:tcPr>
           <w:p>
             <w:pPr>
@@ -1003,29 +1215,47 @@
       <w:tr>
         <w:tc>
           <w:tcPr>
-            <w:tcW w:w="1385" w:type="dxa"/>
-            <w:shd w:val="clear" w:color="auto" w:fill="F2F2F2" w:themeFill="background1" w:themeFillShade="F2"/>
-          </w:tcPr>
-          <w:p>
-            <w:pPr>
-              <w:rPr>
-                <w:sz w:val="20"/>
-                <w:szCs w:val="20"/>
-              </w:rPr>
-            </w:pPr>
-            <w:r>
-              <w:rPr>
-                <w:sz w:val="20"/>
-                <w:szCs w:val="20"/>
-              </w:rPr>
-              <w:t>Warehouse (40hosts)</w:t>
-            </w:r>
-          </w:p>
-        </w:tc>
-        <w:tc>
-          <w:tcPr>
-            <w:tcW w:w="1006" w:type="dxa"/>
-            <w:shd w:val="clear" w:color="auto" w:fill="F2F2F2" w:themeFill="background1" w:themeFillShade="F2"/>
+            <w:tcW w:w="1413" w:type="dxa"/>
+          </w:tcPr>
+          <w:p>
+            <w:pPr>
+              <w:rPr>
+                <w:sz w:val="20"/>
+                <w:szCs w:val="20"/>
+              </w:rPr>
+            </w:pPr>
+            <w:r>
+              <w:rPr>
+                <w:sz w:val="20"/>
+                <w:szCs w:val="20"/>
+              </w:rPr>
+              <w:t>Warehouse</w:t>
+            </w:r>
+          </w:p>
+        </w:tc>
+        <w:tc>
+          <w:tcPr>
+            <w:tcW w:w="992" w:type="dxa"/>
+          </w:tcPr>
+          <w:p>
+            <w:pPr>
+              <w:rPr>
+                <w:sz w:val="20"/>
+                <w:szCs w:val="20"/>
+              </w:rPr>
+            </w:pPr>
+            <w:r>
+              <w:rPr>
+                <w:sz w:val="20"/>
+                <w:szCs w:val="20"/>
+              </w:rPr>
+              <w:t>50</w:t>
+            </w:r>
+          </w:p>
+        </w:tc>
+        <w:tc>
+          <w:tcPr>
+            <w:tcW w:w="992" w:type="dxa"/>
           </w:tcPr>
           <w:p>
             <w:pPr>
@@ -1045,127 +1275,87 @@
         </w:tc>
         <w:tc>
           <w:tcPr>
-            <w:tcW w:w="865" w:type="dxa"/>
-            <w:shd w:val="clear" w:color="auto" w:fill="F2F2F2" w:themeFill="background1" w:themeFillShade="F2"/>
-          </w:tcPr>
-          <w:p>
-            <w:pPr>
-              <w:rPr>
-                <w:sz w:val="20"/>
-                <w:szCs w:val="20"/>
-              </w:rPr>
-            </w:pPr>
-            <w:r>
-              <w:rPr>
-                <w:sz w:val="20"/>
-                <w:szCs w:val="20"/>
-              </w:rPr>
-              <w:t>22</w:t>
-            </w:r>
-          </w:p>
-        </w:tc>
-        <w:tc>
-          <w:tcPr>
-            <w:tcW w:w="1400" w:type="dxa"/>
-            <w:shd w:val="clear" w:color="auto" w:fill="F2F2F2" w:themeFill="background1" w:themeFillShade="F2"/>
-          </w:tcPr>
-          <w:p>
-            <w:pPr>
-              <w:rPr>
-                <w:sz w:val="20"/>
-                <w:szCs w:val="20"/>
-              </w:rPr>
-            </w:pPr>
-            <w:r>
-              <w:rPr>
-                <w:sz w:val="20"/>
-                <w:szCs w:val="20"/>
-              </w:rPr>
-              <w:t>10.0.1.</w:t>
-            </w:r>
-            <w:r>
-              <w:rPr>
-                <w:sz w:val="20"/>
-                <w:szCs w:val="20"/>
-              </w:rPr>
-              <w:t>192</w:t>
-            </w:r>
-          </w:p>
-        </w:tc>
-        <w:tc>
-          <w:tcPr>
-            <w:tcW w:w="2348" w:type="dxa"/>
-            <w:shd w:val="clear" w:color="auto" w:fill="F2F2F2" w:themeFill="background1" w:themeFillShade="F2"/>
-          </w:tcPr>
-          <w:p>
-            <w:pPr>
-              <w:rPr>
-                <w:sz w:val="20"/>
-                <w:szCs w:val="20"/>
-              </w:rPr>
-            </w:pPr>
-            <w:r>
-              <w:rPr>
-                <w:sz w:val="20"/>
-                <w:szCs w:val="20"/>
-              </w:rPr>
-              <w:t>10.0.1.</w:t>
-            </w:r>
-            <w:r>
-              <w:rPr>
-                <w:sz w:val="20"/>
-                <w:szCs w:val="20"/>
-              </w:rPr>
-              <w:t xml:space="preserve">193 - </w:t>
-            </w:r>
-            <w:r>
-              <w:rPr>
-                <w:sz w:val="20"/>
-                <w:szCs w:val="20"/>
-              </w:rPr>
-              <w:t>10.0.1.</w:t>
-            </w:r>
-            <w:r>
-              <w:rPr>
-                <w:sz w:val="20"/>
-                <w:szCs w:val="20"/>
-              </w:rPr>
-              <w:t>254</w:t>
-            </w:r>
-          </w:p>
-        </w:tc>
-        <w:tc>
-          <w:tcPr>
-            <w:tcW w:w="1162" w:type="dxa"/>
-            <w:shd w:val="clear" w:color="auto" w:fill="F2F2F2" w:themeFill="background1" w:themeFillShade="F2"/>
-          </w:tcPr>
-          <w:p>
-            <w:pPr>
-              <w:rPr>
-                <w:sz w:val="20"/>
-                <w:szCs w:val="20"/>
-              </w:rPr>
-            </w:pPr>
-            <w:r>
-              <w:rPr>
-                <w:sz w:val="20"/>
-                <w:szCs w:val="20"/>
-              </w:rPr>
-              <w:t>10.0.1.</w:t>
-            </w:r>
-            <w:r>
-              <w:rPr>
-                <w:sz w:val="20"/>
-                <w:szCs w:val="20"/>
-              </w:rPr>
-              <w:t>255</w:t>
-            </w:r>
-          </w:p>
-        </w:tc>
-        <w:tc>
-          <w:tcPr>
-            <w:tcW w:w="850" w:type="dxa"/>
-            <w:shd w:val="clear" w:color="auto" w:fill="F2F2F2" w:themeFill="background1" w:themeFillShade="F2"/>
+            <w:tcW w:w="851" w:type="dxa"/>
+          </w:tcPr>
+          <w:p>
+            <w:pPr>
+              <w:rPr>
+                <w:sz w:val="20"/>
+                <w:szCs w:val="20"/>
+              </w:rPr>
+            </w:pPr>
+            <w:r>
+              <w:rPr>
+                <w:sz w:val="20"/>
+                <w:szCs w:val="20"/>
+              </w:rPr>
+              <w:t>12</w:t>
+            </w:r>
+          </w:p>
+        </w:tc>
+        <w:tc>
+          <w:tcPr>
+            <w:tcW w:w="1227" w:type="dxa"/>
+          </w:tcPr>
+          <w:p>
+            <w:pPr>
+              <w:rPr>
+                <w:sz w:val="20"/>
+                <w:szCs w:val="20"/>
+              </w:rPr>
+            </w:pPr>
+            <w:r>
+              <w:rPr>
+                <w:sz w:val="20"/>
+                <w:szCs w:val="20"/>
+              </w:rPr>
+              <w:t>10.0.3.64</w:t>
+            </w:r>
+          </w:p>
+        </w:tc>
+        <w:tc>
+          <w:tcPr>
+            <w:tcW w:w="1608" w:type="dxa"/>
+          </w:tcPr>
+          <w:p>
+            <w:pPr>
+              <w:rPr>
+                <w:sz w:val="20"/>
+                <w:szCs w:val="20"/>
+              </w:rPr>
+            </w:pPr>
+            <w:r>
+              <w:rPr>
+                <w:sz w:val="20"/>
+                <w:szCs w:val="20"/>
+              </w:rPr>
+              <w:t>10.0.3.65 – 10.0.3.126</w:t>
+            </w:r>
+          </w:p>
+        </w:tc>
+        <w:tc>
+          <w:tcPr>
+            <w:tcW w:w="1216" w:type="dxa"/>
+          </w:tcPr>
+          <w:p>
+            <w:pPr>
+              <w:rPr>
+                <w:sz w:val="20"/>
+                <w:szCs w:val="20"/>
+              </w:rPr>
+            </w:pPr>
+            <w:r>
+              <w:rPr>
+                <w:sz w:val="20"/>
+                <w:szCs w:val="20"/>
+              </w:rPr>
+              <w:t>10.0.3.127</w:t>
+            </w:r>
+          </w:p>
+        </w:tc>
+        <w:tc>
+          <w:tcPr>
+            <w:tcW w:w="717" w:type="dxa"/>
           </w:tcPr>
           <w:p>
             <w:pPr>
@@ -1187,29 +1377,27 @@
       <w:tr>
         <w:tc>
           <w:tcPr>
-            <w:tcW w:w="1385" w:type="dxa"/>
-            <w:shd w:val="clear" w:color="auto" w:fill="D9D9D9" w:themeFill="background1" w:themeFillShade="D9"/>
-          </w:tcPr>
-          <w:p>
-            <w:pPr>
-              <w:rPr>
-                <w:sz w:val="20"/>
-                <w:szCs w:val="20"/>
-              </w:rPr>
-            </w:pPr>
-            <w:r>
-              <w:rPr>
-                <w:sz w:val="20"/>
-                <w:szCs w:val="20"/>
-              </w:rPr>
-              <w:t>Finance (20hosts)</w:t>
-            </w:r>
-          </w:p>
-        </w:tc>
-        <w:tc>
-          <w:tcPr>
-            <w:tcW w:w="1006" w:type="dxa"/>
-            <w:shd w:val="clear" w:color="auto" w:fill="D9D9D9" w:themeFill="background1" w:themeFillShade="D9"/>
+            <w:tcW w:w="1413" w:type="dxa"/>
+          </w:tcPr>
+          <w:p>
+            <w:pPr>
+              <w:rPr>
+                <w:sz w:val="20"/>
+                <w:szCs w:val="20"/>
+              </w:rPr>
+            </w:pPr>
+            <w:r>
+              <w:rPr>
+                <w:sz w:val="20"/>
+                <w:szCs w:val="20"/>
+              </w:rPr>
+              <w:t>Finance</w:t>
+            </w:r>
+          </w:p>
+        </w:tc>
+        <w:tc>
+          <w:tcPr>
+            <w:tcW w:w="992" w:type="dxa"/>
           </w:tcPr>
           <w:p>
             <w:pPr>
@@ -1229,99 +1417,107 @@
         </w:tc>
         <w:tc>
           <w:tcPr>
-            <w:tcW w:w="865" w:type="dxa"/>
-            <w:shd w:val="clear" w:color="auto" w:fill="D9D9D9" w:themeFill="background1" w:themeFillShade="D9"/>
-          </w:tcPr>
-          <w:p>
-            <w:pPr>
-              <w:rPr>
-                <w:sz w:val="20"/>
-                <w:szCs w:val="20"/>
-              </w:rPr>
-            </w:pPr>
-            <w:r>
-              <w:rPr>
-                <w:sz w:val="20"/>
-                <w:szCs w:val="20"/>
-              </w:rPr>
-              <w:t>10</w:t>
-            </w:r>
-          </w:p>
-        </w:tc>
-        <w:tc>
-          <w:tcPr>
-            <w:tcW w:w="1400" w:type="dxa"/>
-            <w:shd w:val="clear" w:color="auto" w:fill="D9D9D9" w:themeFill="background1" w:themeFillShade="D9"/>
-          </w:tcPr>
-          <w:p>
-            <w:pPr>
-              <w:rPr>
-                <w:sz w:val="20"/>
-                <w:szCs w:val="20"/>
-              </w:rPr>
-            </w:pPr>
-            <w:r>
-              <w:rPr>
-                <w:sz w:val="20"/>
-                <w:szCs w:val="20"/>
-              </w:rPr>
-              <w:t>10.0.2.0</w:t>
-            </w:r>
-          </w:p>
-        </w:tc>
-        <w:tc>
-          <w:tcPr>
-            <w:tcW w:w="2348" w:type="dxa"/>
-            <w:shd w:val="clear" w:color="auto" w:fill="D9D9D9" w:themeFill="background1" w:themeFillShade="D9"/>
-          </w:tcPr>
-          <w:p>
-            <w:pPr>
-              <w:rPr>
-                <w:sz w:val="20"/>
-                <w:szCs w:val="20"/>
-              </w:rPr>
-            </w:pPr>
-            <w:r>
-              <w:rPr>
-                <w:sz w:val="20"/>
-                <w:szCs w:val="20"/>
-              </w:rPr>
-              <w:t>10.0.2.1 – 10.0.2.30</w:t>
-            </w:r>
-          </w:p>
-        </w:tc>
-        <w:tc>
-          <w:tcPr>
-            <w:tcW w:w="1162" w:type="dxa"/>
-            <w:shd w:val="clear" w:color="auto" w:fill="D9D9D9" w:themeFill="background1" w:themeFillShade="D9"/>
-          </w:tcPr>
-          <w:p>
-            <w:pPr>
-              <w:rPr>
-                <w:sz w:val="20"/>
-                <w:szCs w:val="20"/>
-              </w:rPr>
-            </w:pPr>
-            <w:r>
-              <w:rPr>
-                <w:sz w:val="20"/>
-                <w:szCs w:val="20"/>
-              </w:rPr>
-              <w:t>10.0.</w:t>
-            </w:r>
-            <w:r>
-              <w:rPr>
-                <w:sz w:val="20"/>
-                <w:szCs w:val="20"/>
-              </w:rPr>
-              <w:t>2.31</w:t>
-            </w:r>
-          </w:p>
-        </w:tc>
-        <w:tc>
-          <w:tcPr>
-            <w:tcW w:w="850" w:type="dxa"/>
-            <w:shd w:val="clear" w:color="auto" w:fill="D9D9D9" w:themeFill="background1" w:themeFillShade="D9"/>
+            <w:tcW w:w="992" w:type="dxa"/>
+          </w:tcPr>
+          <w:p>
+            <w:pPr>
+              <w:rPr>
+                <w:sz w:val="20"/>
+                <w:szCs w:val="20"/>
+              </w:rPr>
+            </w:pPr>
+            <w:r>
+              <w:rPr>
+                <w:sz w:val="20"/>
+                <w:szCs w:val="20"/>
+              </w:rPr>
+              <w:t>30</w:t>
+            </w:r>
+          </w:p>
+        </w:tc>
+        <w:tc>
+          <w:tcPr>
+            <w:tcW w:w="851" w:type="dxa"/>
+          </w:tcPr>
+          <w:p>
+            <w:pPr>
+              <w:rPr>
+                <w:sz w:val="20"/>
+                <w:szCs w:val="20"/>
+              </w:rPr>
+            </w:pPr>
+            <w:r>
+              <w:rPr>
+                <w:sz w:val="20"/>
+                <w:szCs w:val="20"/>
+              </w:rPr>
+              <w:t>0</w:t>
+            </w:r>
+          </w:p>
+        </w:tc>
+        <w:tc>
+          <w:tcPr>
+            <w:tcW w:w="1227" w:type="dxa"/>
+          </w:tcPr>
+          <w:p>
+            <w:pPr>
+              <w:rPr>
+                <w:sz w:val="20"/>
+                <w:szCs w:val="20"/>
+              </w:rPr>
+            </w:pPr>
+            <w:r>
+              <w:rPr>
+                <w:sz w:val="20"/>
+                <w:szCs w:val="20"/>
+              </w:rPr>
+              <w:t>10.0.3.128</w:t>
+            </w:r>
+          </w:p>
+        </w:tc>
+        <w:tc>
+          <w:tcPr>
+            <w:tcW w:w="1608" w:type="dxa"/>
+          </w:tcPr>
+          <w:p>
+            <w:pPr>
+              <w:rPr>
+                <w:sz w:val="20"/>
+                <w:szCs w:val="20"/>
+              </w:rPr>
+            </w:pPr>
+            <w:r>
+              <w:rPr>
+                <w:sz w:val="20"/>
+                <w:szCs w:val="20"/>
+              </w:rPr>
+              <w:t>10.0.3.129 – 10.0.3.158</w:t>
+            </w:r>
+          </w:p>
+        </w:tc>
+        <w:tc>
+          <w:tcPr>
+            <w:tcW w:w="1216" w:type="dxa"/>
+          </w:tcPr>
+          <w:p>
+            <w:pPr>
+              <w:rPr>
+                <w:sz w:val="20"/>
+                <w:szCs w:val="20"/>
+              </w:rPr>
+            </w:pPr>
+            <w:r>
+              <w:rPr>
+                <w:sz w:val="20"/>
+                <w:szCs w:val="20"/>
+              </w:rPr>
+              <w:t>10.0.3.159</w:t>
+            </w:r>
+          </w:p>
+        </w:tc>
+        <w:tc>
+          <w:tcPr>
+            <w:tcW w:w="717" w:type="dxa"/>
           </w:tcPr>
           <w:p>
             <w:pPr>
@@ -1337,99 +1533,6 @@
               </w:rPr>
               <w:t>/27</w:t>
             </w:r>
-          </w:p>
-        </w:tc>
-      </w:tr>
-      <w:tr>
-        <w:tc>
-          <w:tcPr>
-            <w:tcW w:w="1385" w:type="dxa"/>
-          </w:tcPr>
-          <w:p>
-            <w:pPr>
-              <w:rPr>
-                <w:sz w:val="20"/>
-                <w:szCs w:val="20"/>
-              </w:rPr>
-            </w:pPr>
-          </w:p>
-        </w:tc>
-        <w:tc>
-          <w:tcPr>
-            <w:tcW w:w="1006" w:type="dxa"/>
-          </w:tcPr>
-          <w:p>
-            <w:pPr>
-              <w:rPr>
-                <w:sz w:val="20"/>
-                <w:szCs w:val="20"/>
-              </w:rPr>
-            </w:pPr>
-          </w:p>
-        </w:tc>
-        <w:tc>
-          <w:tcPr>
-            <w:tcW w:w="865" w:type="dxa"/>
-          </w:tcPr>
-          <w:p>
-            <w:pPr>
-              <w:rPr>
-                <w:sz w:val="20"/>
-                <w:szCs w:val="20"/>
-              </w:rPr>
-            </w:pPr>
-          </w:p>
-        </w:tc>
-        <w:tc>
-          <w:tcPr>
-            <w:tcW w:w="1400" w:type="dxa"/>
-          </w:tcPr>
-          <w:p>
-            <w:pPr>
-              <w:rPr>
-                <w:sz w:val="20"/>
-                <w:szCs w:val="20"/>
-              </w:rPr>
-            </w:pPr>
-          </w:p>
-        </w:tc>
-        <w:tc>
-          <w:tcPr>
-            <w:tcW w:w="2348" w:type="dxa"/>
-          </w:tcPr>
-          <w:p>
-            <w:pPr>
-              <w:rPr>
-                <w:sz w:val="20"/>
-                <w:szCs w:val="20"/>
-              </w:rPr>
-            </w:pPr>
-          </w:p>
-        </w:tc>
-        <w:tc>
-          <w:tcPr>
-            <w:tcW w:w="1162" w:type="dxa"/>
-          </w:tcPr>
-          <w:p>
-            <w:pPr>
-              <w:rPr>
-                <w:sz w:val="20"/>
-                <w:szCs w:val="20"/>
-              </w:rPr>
-            </w:pPr>
-          </w:p>
-        </w:tc>
-        <w:tc>
-          <w:tcPr>
-            <w:tcW w:w="850" w:type="dxa"/>
-          </w:tcPr>
-          <w:p>
-            <w:pPr>
-              <w:rPr>
-                <w:sz w:val="20"/>
-                <w:szCs w:val="20"/>
-              </w:rPr>
-            </w:pPr>
           </w:p>
         </w:tc>
       </w:tr>
@@ -1464,7 +1567,7 @@
         <w:rFonts w:ascii="Symbol" w:eastAsiaTheme="minorHAnsi" w:hAnsi="Symbol" w:cs="Arial" w:hint="default"/>
       </w:rPr>
     </w:lvl>
-    <w:lvl w:ilvl="1" w:tplc="08090003" w:tentative="1">
+    <w:lvl w:ilvl="1" w:tplc="08090003">
       <w:start w:val="1"/>
       <w:numFmt w:val="bullet"/>
       <w:lvlText w:val="o"/>
@@ -1476,7 +1579,7 @@
         <w:rFonts w:ascii="Courier New" w:hAnsi="Courier New" w:cs="Courier New" w:hint="default"/>
       </w:rPr>
     </w:lvl>
-    <w:lvl w:ilvl="2" w:tplc="08090005" w:tentative="1">
+    <w:lvl w:ilvl="2" w:tplc="08090005">
       <w:start w:val="1"/>
       <w:numFmt w:val="bullet"/>
       <w:lvlText w:val=""/>
@@ -2286,7 +2389,6 @@
   <w:style w:type="character" w:default="1" w:styleId="DefaultParagraphFont">
     <w:name w:val="Default Paragraph Font"/>
     <w:uiPriority w:val="1"/>
-    <w:semiHidden/>
     <w:unhideWhenUsed/>
   </w:style>
   <w:style w:type="table" w:default="1" w:styleId="TableNormal">

</xml_diff>

<commit_message>
OSPF, HSPR, default & static route - topology 80% complete
</commit_message>
<xml_diff>
--- a/project plan.docx
+++ b/project plan.docx
@@ -3074,6 +3074,157 @@
         </w:tc>
       </w:tr>
     </w:tbl>
+    <w:p>
+      <w:pPr>
+        <w:rPr>
+          <w:rFonts w:ascii="Times New Roman" w:hAnsi="Times New Roman" w:cs="Times New Roman"/>
+        </w:rPr>
+      </w:pPr>
+    </w:p>
+    <w:p>
+      <w:pPr>
+        <w:rPr>
+          <w:rFonts w:ascii="Times New Roman" w:hAnsi="Times New Roman" w:cs="Times New Roman"/>
+        </w:rPr>
+      </w:pPr>
+    </w:p>
+    <w:p>
+      <w:pPr>
+        <w:rPr>
+          <w:rFonts w:ascii="Times New Roman" w:hAnsi="Times New Roman" w:cs="Times New Roman"/>
+        </w:rPr>
+      </w:pPr>
+      <w:r>
+        <w:rPr>
+          <w:rFonts w:ascii="Times New Roman" w:hAnsi="Times New Roman" w:cs="Times New Roman"/>
+        </w:rPr>
+        <w:t>Introduction</w:t>
+      </w:r>
+    </w:p>
+    <w:p>
+      <w:pPr>
+        <w:rPr>
+          <w:rFonts w:ascii="Times New Roman" w:hAnsi="Times New Roman" w:cs="Times New Roman"/>
+        </w:rPr>
+      </w:pPr>
+      <w:r>
+        <w:rPr>
+          <w:rFonts w:ascii="Times New Roman" w:hAnsi="Times New Roman" w:cs="Times New Roman"/>
+        </w:rPr>
+        <w:t>Assumption</w:t>
+      </w:r>
+    </w:p>
+    <w:p>
+      <w:pPr>
+        <w:rPr>
+          <w:rFonts w:ascii="Times New Roman" w:hAnsi="Times New Roman" w:cs="Times New Roman"/>
+        </w:rPr>
+      </w:pPr>
+      <w:r>
+        <w:rPr>
+          <w:rFonts w:ascii="Times New Roman" w:hAnsi="Times New Roman" w:cs="Times New Roman"/>
+        </w:rPr>
+        <w:t>Network Topology &amp; Design</w:t>
+      </w:r>
+    </w:p>
+    <w:p>
+      <w:pPr>
+        <w:rPr>
+          <w:rFonts w:ascii="Times New Roman" w:hAnsi="Times New Roman" w:cs="Times New Roman"/>
+        </w:rPr>
+      </w:pPr>
+      <w:r>
+        <w:rPr>
+          <w:rFonts w:ascii="Times New Roman" w:hAnsi="Times New Roman" w:cs="Times New Roman"/>
+        </w:rPr>
+        <w:t>IP Addressing &amp; VLAN Configuration</w:t>
+      </w:r>
+    </w:p>
+    <w:p>
+      <w:pPr>
+        <w:rPr>
+          <w:rFonts w:ascii="Times New Roman" w:hAnsi="Times New Roman" w:cs="Times New Roman"/>
+        </w:rPr>
+      </w:pPr>
+      <w:r>
+        <w:rPr>
+          <w:rFonts w:ascii="Times New Roman" w:hAnsi="Times New Roman" w:cs="Times New Roman"/>
+        </w:rPr>
+        <w:t>Wireless LAN &amp; BYOD Configuration</w:t>
+      </w:r>
+    </w:p>
+    <w:p>
+      <w:pPr>
+        <w:rPr>
+          <w:rFonts w:ascii="Times New Roman" w:hAnsi="Times New Roman" w:cs="Times New Roman"/>
+        </w:rPr>
+      </w:pPr>
+      <w:r>
+        <w:rPr>
+          <w:rFonts w:ascii="Times New Roman" w:hAnsi="Times New Roman" w:cs="Times New Roman"/>
+        </w:rPr>
+        <w:t>Layer 2 Security</w:t>
+      </w:r>
+    </w:p>
+    <w:p>
+      <w:pPr>
+        <w:rPr>
+          <w:rFonts w:ascii="Times New Roman" w:hAnsi="Times New Roman" w:cs="Times New Roman"/>
+        </w:rPr>
+      </w:pPr>
+      <w:r>
+        <w:rPr>
+          <w:rFonts w:ascii="Times New Roman" w:hAnsi="Times New Roman" w:cs="Times New Roman"/>
+        </w:rPr>
+        <w:t>Routing &amp; Internet Access</w:t>
+      </w:r>
+    </w:p>
+    <w:p>
+      <w:pPr>
+        <w:rPr>
+          <w:rFonts w:ascii="Times New Roman" w:hAnsi="Times New Roman" w:cs="Times New Roman"/>
+        </w:rPr>
+      </w:pPr>
+      <w:r>
+        <w:rPr>
+          <w:rFonts w:ascii="Times New Roman" w:hAnsi="Times New Roman" w:cs="Times New Roman"/>
+        </w:rPr>
+        <w:t>Overall Network Security</w:t>
+      </w:r>
+    </w:p>
+    <w:p>
+      <w:pPr>
+        <w:rPr>
+          <w:rFonts w:ascii="Times New Roman" w:hAnsi="Times New Roman" w:cs="Times New Roman"/>
+        </w:rPr>
+      </w:pPr>
+      <w:r>
+        <w:rPr>
+          <w:rFonts w:ascii="Times New Roman" w:hAnsi="Times New Roman" w:cs="Times New Roman"/>
+        </w:rPr>
+        <w:t>Design Justifications</w:t>
+      </w:r>
+    </w:p>
+    <w:p>
+      <w:pPr>
+        <w:rPr>
+          <w:rFonts w:ascii="Times New Roman" w:hAnsi="Times New Roman" w:cs="Times New Roman"/>
+        </w:rPr>
+      </w:pPr>
+      <w:r>
+        <w:rPr>
+          <w:rFonts w:ascii="Times New Roman" w:hAnsi="Times New Roman" w:cs="Times New Roman"/>
+        </w:rPr>
+        <w:t>Packet Tracer Topology</w:t>
+      </w:r>
+    </w:p>
+    <w:p>
+      <w:pPr>
+        <w:rPr>
+          <w:rFonts w:ascii="Times New Roman" w:hAnsi="Times New Roman" w:cs="Times New Roman"/>
+        </w:rPr>
+      </w:pPr>
+    </w:p>
     <w:p>
       <w:pPr>
         <w:rPr>
@@ -3931,6 +4082,7 @@
   <w:style w:type="character" w:default="1" w:styleId="DefaultParagraphFont">
     <w:name w:val="Default Paragraph Font"/>
     <w:uiPriority w:val="1"/>
+    <w:semiHidden/>
     <w:unhideWhenUsed/>
   </w:style>
   <w:style w:type="table" w:default="1" w:styleId="TableNormal">

</xml_diff>